<commit_message>
Harris is missing — update ending across game, story.html and docx
- Win screen: Harris never exited; audio log found inside Level 5,
  status MISSING NOV 14 1994, no body recovered, 48 entered / none came out
- story.html Chapter VIII + epilogue: retrieval team found device not Harris,
  sealed case files on his desk marked resolved, Dept dissolved March 1996
- Docx regenerated with same narrative changes

Co-Authored-By: Claude Sonnet 4.6 <noreply@anthropic.com>
</commit_message>
<xml_diff>
--- a/Case File 1994 — Story.docx
+++ b/Case File 1994 — Story.docx
@@ -4036,7 +4036,7 @@
           <w:color w:val="221C12"/>
           <w:sz w:val="24"/>
         </w:rPr>
-        <w:t>Harris exited the Aldric Building on November 7, 1994 — two days after entry. His final recorded statement, recovered from a personal audio device found near the building's south exit, reads as follows:</w:t>
+        <w:t>The last known audio recording attributed to Detective S. Harris was recovered from a personal device found inside the Aldric Building — Level 5, Containment Core — on November 9, 1994, by a Department retrieval team. Harris himself was not found.</w:t>
       </w:r>
     </w:p>
     <w:p>
@@ -4061,7 +4061,7 @@
           <w:color w:val="2C3E7A"/>
           <w:sz w:val="18"/>
         </w:rPr>
-        <w:t>HARRIS — AUDIO LOG  |  NOVEMBER 7, 1994</w:t>
+        <w:t>HARRIS — AUDIO LOG  |  NOVEMBER 7, 1994  |  FINAL RECORDING</w:t>
       </w:r>
     </w:p>
     <w:p>
@@ -4119,6 +4119,41 @@
     </w:p>
     <w:p>
       <w:pPr>
+        <w:spacing w:before="0" w:after="80"/>
+        <w:ind w:left="360" w:firstLine="0"/>
+        <w:jc w:val="left"/>
+        <w:shd w:val="clear" w:color="auto" w:fill="EEF0F8"/>
+      </w:pPr>
+      <w:r>
+        <w:rPr>
+          <w:rFonts w:ascii="Garamond" w:hAnsi="Garamond"/>
+          <w:b w:val="0"/>
+          <w:i/>
+          <w:color w:val="2A3055"/>
+          <w:sz w:val="22"/>
+        </w:rPr>
+      </w:r>
+    </w:p>
+    <w:p>
+      <w:pPr>
+        <w:spacing w:before="0" w:after="80"/>
+        <w:ind w:left="360" w:firstLine="0"/>
+        <w:jc w:val="left"/>
+        <w:shd w:val="clear" w:color="auto" w:fill="EEF0F8"/>
+      </w:pPr>
+      <w:r>
+        <w:rPr>
+          <w:rFonts w:ascii="Garamond" w:hAnsi="Garamond"/>
+          <w:b w:val="0"/>
+          <w:i/>
+          <w:color w:val="2A3055"/>
+          <w:sz w:val="22"/>
+        </w:rPr>
+        <w:t>[Recording ends. Duration: 0:09. No further entries.]</w:t>
+      </w:r>
+    </w:p>
+    <w:p>
+      <w:pPr>
         <w:spacing w:before="80" w:after="80"/>
         <w:ind w:left="360" w:firstLine="0"/>
         <w:jc w:val="right"/>
@@ -4138,6 +4173,57 @@
       <w:pPr>
         <w:spacing w:before="0" w:after="0" w:lineRule="exact" w:line="80"/>
       </w:pPr>
+    </w:p>
+    <w:p>
+      <w:pPr>
+        <w:spacing w:before="0" w:after="160"/>
+        <w:ind w:firstLine="432"/>
+        <w:jc w:val="both"/>
+      </w:pPr>
+      <w:r>
+        <w:rPr>
+          <w:rFonts w:ascii="Garamond" w:hAnsi="Garamond"/>
+          <w:b w:val="0"/>
+          <w:i w:val="0"/>
+          <w:color w:val="221C12"/>
+          <w:sz w:val="24"/>
+        </w:rPr>
+        <w:t>The retrieval team reported no sign of forced entry on any internal door. No blood. No struggle. The building was quiet. The exit Harris had been moving toward was found sealed from the inside.</w:t>
+      </w:r>
+    </w:p>
+    <w:p>
+      <w:pPr>
+        <w:spacing w:before="0" w:after="160"/>
+        <w:ind w:firstLine="432"/>
+        <w:jc w:val="both"/>
+      </w:pPr>
+      <w:r>
+        <w:rPr>
+          <w:rFonts w:ascii="Garamond" w:hAnsi="Garamond"/>
+          <w:b w:val="0"/>
+          <w:i w:val="0"/>
+          <w:color w:val="221C12"/>
+          <w:sz w:val="24"/>
+        </w:rPr>
+        <w:t>His three open case files were recovered from his office desk the following week. Each was neatly closed. Each bore a handwritten notation in the margin: resolved. No resolution was documented. No client had been contacted.</w:t>
+      </w:r>
+    </w:p>
+    <w:p>
+      <w:pPr>
+        <w:spacing w:before="0" w:after="160"/>
+        <w:ind w:firstLine="432"/>
+        <w:jc w:val="both"/>
+      </w:pPr>
+      <w:r>
+        <w:rPr>
+          <w:rFonts w:ascii="Garamond" w:hAnsi="Garamond"/>
+          <w:b w:val="0"/>
+          <w:i w:val="0"/>
+          <w:color w:val="221C12"/>
+          <w:sz w:val="24"/>
+        </w:rPr>
+        <w:t>Harris was formally reported missing on November 14, 1994. The investigation into his disappearance was assigned to the Department of Anomalous Research and immediately classified.</w:t>
+      </w:r>
     </w:p>
     <w:p>
       <w:pPr>
@@ -4303,6 +4389,59 @@
           <w:color w:val="443A22"/>
           <w:sz w:val="20"/>
         </w:rPr>
+        <w:t>STATUS: MISSING — NOV 14, 1994.</w:t>
+      </w:r>
+    </w:p>
+    <w:p>
+      <w:pPr>
+        <w:spacing w:before="0" w:after="40"/>
+        <w:ind w:left="432" w:firstLine="0"/>
+        <w:jc w:val="left"/>
+        <w:shd w:val="clear" w:color="auto" w:fill="F5E8E8"/>
+      </w:pPr>
+      <w:r>
+        <w:rPr>
+          <w:rFonts w:ascii="Courier New" w:hAnsi="Courier New"/>
+          <w:b w:val="0"/>
+          <w:i/>
+          <w:color w:val="443A22"/>
+          <w:sz w:val="20"/>
+        </w:rPr>
+        <w:t>Last confirmed location: Aldric Building, Level 5.</w:t>
+      </w:r>
+    </w:p>
+    <w:p>
+      <w:pPr>
+        <w:spacing w:before="0" w:after="40"/>
+        <w:ind w:left="432" w:firstLine="0"/>
+        <w:jc w:val="left"/>
+        <w:shd w:val="clear" w:color="auto" w:fill="F5E8E8"/>
+      </w:pPr>
+      <w:r>
+        <w:rPr>
+          <w:rFonts w:ascii="Courier New" w:hAnsi="Courier New"/>
+          <w:b w:val="0"/>
+          <w:i/>
+          <w:color w:val="443A22"/>
+          <w:sz w:val="20"/>
+        </w:rPr>
+      </w:r>
+    </w:p>
+    <w:p>
+      <w:pPr>
+        <w:spacing w:before="0" w:after="40"/>
+        <w:ind w:left="432" w:firstLine="0"/>
+        <w:jc w:val="left"/>
+        <w:shd w:val="clear" w:color="auto" w:fill="F5E8E8"/>
+      </w:pPr>
+      <w:r>
+        <w:rPr>
+          <w:rFonts w:ascii="Courier New" w:hAnsi="Courier New"/>
+          <w:b w:val="0"/>
+          <w:i/>
+          <w:color w:val="443A22"/>
+          <w:sz w:val="20"/>
+        </w:rPr>
         <w:t>The Aldric Building was demolished. May 1995.</w:t>
       </w:r>
     </w:p>
@@ -4339,6 +4478,24 @@
           <w:color w:val="443A22"/>
           <w:sz w:val="20"/>
         </w:rPr>
+        <w:t>No body was recovered.</w:t>
+      </w:r>
+    </w:p>
+    <w:p>
+      <w:pPr>
+        <w:spacing w:before="0" w:after="40"/>
+        <w:ind w:left="432" w:firstLine="0"/>
+        <w:jc w:val="left"/>
+        <w:shd w:val="clear" w:color="auto" w:fill="F5E8E8"/>
+      </w:pPr>
+      <w:r>
+        <w:rPr>
+          <w:rFonts w:ascii="Courier New" w:hAnsi="Courier New"/>
+          <w:b w:val="0"/>
+          <w:i/>
+          <w:color w:val="443A22"/>
+          <w:sz w:val="20"/>
+        </w:rPr>
       </w:r>
     </w:p>
     <w:p>
@@ -4429,6 +4586,27 @@
           <w:sz w:val="24"/>
         </w:rPr>
         <w:t>He was called there.</w:t>
+      </w:r>
+    </w:p>
+    <w:p>
+      <w:pPr>
+        <w:spacing w:before="0" w:after="0" w:lineRule="exact" w:line="80"/>
+      </w:pPr>
+    </w:p>
+    <w:p>
+      <w:pPr>
+        <w:spacing w:before="0" w:after="160"/>
+        <w:jc w:val="both"/>
+      </w:pPr>
+      <w:r>
+        <w:rPr>
+          <w:rFonts w:ascii="Garamond" w:hAnsi="Garamond"/>
+          <w:b w:val="0"/>
+          <w:i w:val="0"/>
+          <w:color w:val="221C12"/>
+          <w:sz w:val="24"/>
+        </w:rPr>
+        <w:t>He is still there.</w:t>
       </w:r>
     </w:p>
     <w:p>
@@ -4531,7 +4709,39 @@
           <w:color w:val="554E3A"/>
           <w:sz w:val="24"/>
         </w:rPr>
-        <w:t>The Aldric Building no longer stands.</w:t>
+        <w:t>The Aldric Building was demolished in May 1995.</w:t>
+      </w:r>
+    </w:p>
+    <w:p>
+      <w:pPr>
+        <w:spacing w:before="0" w:after="60"/>
+        <w:jc w:val="center"/>
+      </w:pPr>
+      <w:r>
+        <w:rPr>
+          <w:rFonts w:ascii="Garamond" w:hAnsi="Garamond"/>
+          <w:b w:val="0"/>
+          <w:i/>
+          <w:color w:val="554E3A"/>
+          <w:sz w:val="24"/>
+        </w:rPr>
+        <w:t>No transmitter was found in the rubble.</w:t>
+      </w:r>
+    </w:p>
+    <w:p>
+      <w:pPr>
+        <w:spacing w:before="0" w:after="60"/>
+        <w:jc w:val="center"/>
+      </w:pPr>
+      <w:r>
+        <w:rPr>
+          <w:rFonts w:ascii="Garamond" w:hAnsi="Garamond"/>
+          <w:b w:val="0"/>
+          <w:i/>
+          <w:color w:val="554E3A"/>
+          <w:sz w:val="24"/>
+        </w:rPr>
+        <w:t>No body was recovered.</w:t>
       </w:r>
     </w:p>
     <w:p>
@@ -4562,7 +4772,23 @@
           <w:color w:val="554E3A"/>
           <w:sz w:val="24"/>
         </w:rPr>
-        <w:t>The frequency has not been detected since November 1994.</w:t>
+        <w:t>Detective S. Harris remains listed as missing.</w:t>
+      </w:r>
+    </w:p>
+    <w:p>
+      <w:pPr>
+        <w:spacing w:before="0" w:after="60"/>
+        <w:jc w:val="center"/>
+      </w:pPr>
+      <w:r>
+        <w:rPr>
+          <w:rFonts w:ascii="Garamond" w:hAnsi="Garamond"/>
+          <w:b w:val="0"/>
+          <w:i/>
+          <w:color w:val="554E3A"/>
+          <w:sz w:val="24"/>
+        </w:rPr>
+        <w:t>His case is inactive.</w:t>
       </w:r>
     </w:p>
     <w:p>
@@ -4593,7 +4819,7 @@
           <w:color w:val="554E3A"/>
           <w:sz w:val="24"/>
         </w:rPr>
-        <w:t>Detective Harris closed his remaining open cases in December 1994.</w:t>
+        <w:t>The Department of Anomalous Research</w:t>
       </w:r>
     </w:p>
     <w:p>
@@ -4609,7 +4835,39 @@
           <w:color w:val="554E3A"/>
           <w:sz w:val="24"/>
         </w:rPr>
-        <w:t>He retired from private investigation in 1995.</w:t>
+        <w:t>was quietly dissolved in March 1996.</w:t>
+      </w:r>
+    </w:p>
+    <w:p>
+      <w:pPr>
+        <w:spacing w:before="0" w:after="60"/>
+        <w:jc w:val="center"/>
+      </w:pPr>
+      <w:r>
+        <w:rPr>
+          <w:rFonts w:ascii="Garamond" w:hAnsi="Garamond"/>
+          <w:b w:val="0"/>
+          <w:i/>
+          <w:color w:val="554E3A"/>
+          <w:sz w:val="24"/>
+        </w:rPr>
+        <w:t>Its files were not transferred.</w:t>
+      </w:r>
+    </w:p>
+    <w:p>
+      <w:pPr>
+        <w:spacing w:before="0" w:after="60"/>
+        <w:jc w:val="center"/>
+      </w:pPr>
+      <w:r>
+        <w:rPr>
+          <w:rFonts w:ascii="Garamond" w:hAnsi="Garamond"/>
+          <w:b w:val="0"/>
+          <w:i/>
+          <w:color w:val="554E3A"/>
+          <w:sz w:val="24"/>
+        </w:rPr>
+        <w:t>Its personnel were not named.</w:t>
       </w:r>
     </w:p>
     <w:p>
@@ -4640,7 +4898,7 @@
           <w:color w:val="554E3A"/>
           <w:sz w:val="24"/>
         </w:rPr>
-        <w:t>He does not discuss the Aldric Building.</w:t>
+        <w:t>Forty-eight people entered the Aldric Building.</w:t>
       </w:r>
     </w:p>
     <w:p>
@@ -4656,7 +4914,7 @@
           <w:color w:val="554E3A"/>
           <w:sz w:val="24"/>
         </w:rPr>
-        <w:t>He does not remember the tape dated 1991.</w:t>
+        <w:t>None came out.</w:t>
       </w:r>
     </w:p>
     <w:p>
@@ -4687,7 +4945,7 @@
           <w:color w:val="554E3A"/>
           <w:sz w:val="24"/>
         </w:rPr>
-        <w:t>He still hears something at night.</w:t>
+        <w:t>The frequency has not been detected since.</w:t>
       </w:r>
     </w:p>
     <w:p>
@@ -4703,7 +4961,6 @@
           <w:color w:val="554E3A"/>
           <w:sz w:val="24"/>
         </w:rPr>
-        <w:t>Just below the threshold of speech.</w:t>
       </w:r>
     </w:p>
     <w:p>
@@ -4719,7 +4976,7 @@
           <w:color w:val="554E3A"/>
           <w:sz w:val="24"/>
         </w:rPr>
-        <w:t>Something that responds when he listens back.</w:t>
+        <w:t>No one is looking.</w:t>
       </w:r>
     </w:p>
     <w:p>

</xml_diff>

<commit_message>
Remove monster reveal chapter — entities only surface inside the building
Chapter IV (The Nature of the Entity) removed from story.html and docx.
The Figure and Listener are no longer described before Harris enters —
they emerge only through tapes and field notes he finds inside.
Chapters renumbered IV-VII accordingly.

Co-Authored-By: Claude Sonnet 4.6 <noreply@anthropic.com>
</commit_message>
<xml_diff>
--- a/Case File 1994 — Story.docx
+++ b/Case File 1994 — Story.docx
@@ -1725,664 +1725,6 @@
           <w:color w:val="B8983C"/>
           <w:sz w:val="40"/>
         </w:rPr>
-        <w:t>THE NATURE OF THE ENTITY</w:t>
-      </w:r>
-    </w:p>
-    <w:p>
-      <w:pPr>
-        <w:spacing w:before="200" w:after="600"/>
-        <w:jc w:val="center"/>
-      </w:pPr>
-      <w:r>
-        <w:rPr>
-          <w:rFonts w:ascii="Garamond" w:hAnsi="Garamond"/>
-          <w:b w:val="0"/>
-          <w:i/>
-          <w:color w:val="554E3A"/>
-          <w:sz w:val="22"/>
-        </w:rPr>
-        <w:t>"Do not look at it directly."</w:t>
-      </w:r>
-    </w:p>
-    <w:p>
-      <w:pPr>
-        <w:spacing w:before="0" w:after="160"/>
-        <w:ind w:firstLine="432"/>
-        <w:jc w:val="both"/>
-      </w:pPr>
-      <w:r>
-        <w:rPr>
-          <w:rFonts w:ascii="Garamond" w:hAnsi="Garamond"/>
-          <w:b w:val="0"/>
-          <w:i w:val="0"/>
-          <w:color w:val="221C12"/>
-          <w:sz w:val="24"/>
-        </w:rPr>
-        <w:t>Two distinct manifestations of the absorbed frequency were encountered during the 1994 investigation. They are designated here by the names used in the recovered field recordings.</w:t>
-      </w:r>
-    </w:p>
-    <w:p>
-      <w:pPr>
-        <w:spacing w:before="560" w:after="80"/>
-        <w:jc w:val="left"/>
-      </w:pPr>
-      <w:r>
-        <w:rPr>
-          <w:rFonts w:ascii="Garamond" w:hAnsi="Garamond"/>
-          <w:b/>
-          <w:i w:val="0"/>
-          <w:smallCaps/>
-          <w:color w:val="8B1A1A"/>
-          <w:sz w:val="26"/>
-        </w:rPr>
-        <w:t>The Figure</w:t>
-      </w:r>
-    </w:p>
-    <w:p>
-      <w:pPr>
-        <w:spacing w:before="0" w:after="160"/>
-        <w:ind w:firstLine="432"/>
-        <w:jc w:val="both"/>
-      </w:pPr>
-      <w:r>
-        <w:rPr>
-          <w:rFonts w:ascii="Garamond" w:hAnsi="Garamond"/>
-          <w:b w:val="0"/>
-          <w:i w:val="0"/>
-          <w:color w:val="221C12"/>
-          <w:sz w:val="24"/>
-        </w:rPr>
-        <w:t>The primary manifestation. It moves. It hunts. It learns from each encounter, adapting patrol patterns and response speed over time. It does not communicate. It does not warn.</w:t>
-      </w:r>
-    </w:p>
-    <w:p>
-      <w:pPr>
-        <w:spacing w:before="0" w:after="160"/>
-        <w:ind w:firstLine="432"/>
-        <w:jc w:val="both"/>
-      </w:pPr>
-      <w:r>
-        <w:rPr>
-          <w:rFonts w:ascii="Garamond" w:hAnsi="Garamond"/>
-          <w:b w:val="0"/>
-          <w:i w:val="0"/>
-          <w:color w:val="221C12"/>
-          <w:sz w:val="24"/>
-        </w:rPr>
-        <w:t>Researchers speculate it is a composite of multiple absorbed identities — the 47 workers, compressed into a single mobile form that retains only one imperative: prevent exit.</w:t>
-      </w:r>
-    </w:p>
-    <w:p>
-      <w:pPr>
-        <w:spacing w:before="560" w:after="80"/>
-        <w:jc w:val="left"/>
-      </w:pPr>
-      <w:r>
-        <w:rPr>
-          <w:rFonts w:ascii="Garamond" w:hAnsi="Garamond"/>
-          <w:b/>
-          <w:i w:val="0"/>
-          <w:smallCaps/>
-          <w:color w:val="8B1A1A"/>
-          <w:sz w:val="26"/>
-        </w:rPr>
-        <w:t>The Listener</w:t>
-      </w:r>
-    </w:p>
-    <w:p>
-      <w:pPr>
-        <w:spacing w:before="0" w:after="160"/>
-        <w:ind w:firstLine="432"/>
-        <w:jc w:val="both"/>
-      </w:pPr>
-      <w:r>
-        <w:rPr>
-          <w:rFonts w:ascii="Garamond" w:hAnsi="Garamond"/>
-          <w:b w:val="0"/>
-          <w:i w:val="0"/>
-          <w:color w:val="221C12"/>
-          <w:sz w:val="24"/>
-        </w:rPr>
-        <w:t>Encountered in Sublevels C2 and the Containment Core. Blind. Responds exclusively to acoustic stimuli — footsteps, breathing, vibration. Threat level exceeds that of The Figure in confined environments.</w:t>
-      </w:r>
-    </w:p>
-    <w:p>
-      <w:pPr>
-        <w:spacing w:before="0" w:after="160"/>
-        <w:ind w:firstLine="432"/>
-        <w:jc w:val="both"/>
-      </w:pPr>
-      <w:r>
-        <w:rPr>
-          <w:rFonts w:ascii="Garamond" w:hAnsi="Garamond"/>
-          <w:b w:val="0"/>
-          <w:i w:val="0"/>
-          <w:color w:val="221C12"/>
-          <w:sz w:val="24"/>
-        </w:rPr>
-        <w:t>It does not sleep. It locates sound sources faster with each detection. It is not just detecting. It is learning.</w:t>
-      </w:r>
-    </w:p>
-    <w:p>
-      <w:pPr>
-        <w:spacing w:before="0" w:after="0" w:lineRule="exact" w:line="80"/>
-      </w:pPr>
-    </w:p>
-    <w:p>
-      <w:pPr>
-        <w:spacing w:before="120" w:after="0"/>
-        <w:ind w:left="432" w:firstLine="0"/>
-        <w:jc w:val="right"/>
-      </w:pPr>
-      <w:r>
-        <w:rPr>
-          <w:rFonts w:ascii="Courier New" w:hAnsi="Courier New"/>
-          <w:b/>
-          <w:i w:val="0"/>
-          <w:smallCaps/>
-          <w:color w:val="8B1A1A"/>
-          <w:sz w:val="16"/>
-        </w:rPr>
-        <w:t>[ THREAT: CRITICAL ]</w:t>
-      </w:r>
-    </w:p>
-    <w:p>
-      <w:pPr>
-        <w:spacing w:before="0" w:after="80"/>
-        <w:ind w:left="432" w:firstLine="0"/>
-        <w:pBdr>
-          <w:bottom w:val="single" w:sz="4" w:space="2" w:color="8A6E28"/>
-        </w:pBdr>
-      </w:pPr>
-      <w:r>
-        <w:rPr>
-          <w:rFonts w:ascii="Courier New" w:hAnsi="Courier New"/>
-          <w:b/>
-          <w:i w:val="0"/>
-          <w:color w:val="8A6E28"/>
-          <w:sz w:val="19"/>
-        </w:rPr>
-        <w:t>DEPT. MEMO — SUBJECT DESIGNATION: THE LISTENER</w:t>
-      </w:r>
-    </w:p>
-    <w:p>
-      <w:pPr>
-        <w:spacing w:before="0" w:after="40"/>
-        <w:ind w:left="432" w:firstLine="0"/>
-        <w:jc w:val="left"/>
-        <w:shd w:val="clear" w:color="auto" w:fill="F5E8E8"/>
-      </w:pPr>
-      <w:r>
-        <w:rPr>
-          <w:rFonts w:ascii="Courier New" w:hAnsi="Courier New"/>
-          <w:b w:val="0"/>
-          <w:i/>
-          <w:color w:val="443A22"/>
-          <w:sz w:val="20"/>
-        </w:rPr>
-        <w:t>Blind. Responds exclusively to acoustic stimuli.</w:t>
-      </w:r>
-    </w:p>
-    <w:p>
-      <w:pPr>
-        <w:spacing w:before="0" w:after="40"/>
-        <w:ind w:left="432" w:firstLine="0"/>
-        <w:jc w:val="left"/>
-        <w:shd w:val="clear" w:color="auto" w:fill="F5E8E8"/>
-      </w:pPr>
-      <w:r>
-        <w:rPr>
-          <w:rFonts w:ascii="Courier New" w:hAnsi="Courier New"/>
-          <w:b w:val="0"/>
-          <w:i/>
-          <w:color w:val="443A22"/>
-          <w:sz w:val="20"/>
-        </w:rPr>
-        <w:t>Threat level: CRITICAL.</w:t>
-      </w:r>
-    </w:p>
-    <w:p>
-      <w:pPr>
-        <w:spacing w:before="0" w:after="40"/>
-        <w:ind w:left="432" w:firstLine="0"/>
-        <w:jc w:val="left"/>
-        <w:shd w:val="clear" w:color="auto" w:fill="F5E8E8"/>
-      </w:pPr>
-      <w:r>
-        <w:rPr>
-          <w:rFonts w:ascii="Courier New" w:hAnsi="Courier New"/>
-          <w:b w:val="0"/>
-          <w:i/>
-          <w:color w:val="443A22"/>
-          <w:sz w:val="20"/>
-        </w:rPr>
-      </w:r>
-    </w:p>
-    <w:p>
-      <w:pPr>
-        <w:spacing w:before="0" w:after="40"/>
-        <w:ind w:left="432" w:firstLine="0"/>
-        <w:jc w:val="left"/>
-        <w:shd w:val="clear" w:color="auto" w:fill="F5E8E8"/>
-      </w:pPr>
-      <w:r>
-        <w:rPr>
-          <w:rFonts w:ascii="Courier New" w:hAnsi="Courier New"/>
-          <w:b w:val="0"/>
-          <w:i/>
-          <w:color w:val="443A22"/>
-          <w:sz w:val="20"/>
-        </w:rPr>
-        <w:t>Do not run. Do not sprint.</w:t>
-      </w:r>
-    </w:p>
-    <w:p>
-      <w:pPr>
-        <w:spacing w:before="0" w:after="40"/>
-        <w:ind w:left="432" w:firstLine="0"/>
-        <w:jc w:val="left"/>
-        <w:shd w:val="clear" w:color="auto" w:fill="F5E8E8"/>
-      </w:pPr>
-      <w:r>
-        <w:rPr>
-          <w:rFonts w:ascii="Courier New" w:hAnsi="Courier New"/>
-          <w:b w:val="0"/>
-          <w:i/>
-          <w:color w:val="443A22"/>
-          <w:sz w:val="20"/>
-        </w:rPr>
-        <w:t>It hears heartbeats at close range.</w:t>
-      </w:r>
-    </w:p>
-    <w:p>
-      <w:pPr>
-        <w:spacing w:before="0" w:after="40"/>
-        <w:ind w:left="432" w:firstLine="0"/>
-        <w:jc w:val="left"/>
-        <w:shd w:val="clear" w:color="auto" w:fill="F5E8E8"/>
-      </w:pPr>
-      <w:r>
-        <w:rPr>
-          <w:rFonts w:ascii="Courier New" w:hAnsi="Courier New"/>
-          <w:b w:val="0"/>
-          <w:i/>
-          <w:color w:val="443A22"/>
-          <w:sz w:val="20"/>
-        </w:rPr>
-        <w:t>Silence is your only protection.</w:t>
-      </w:r>
-    </w:p>
-    <w:p>
-      <w:pPr>
-        <w:spacing w:before="0" w:after="0" w:lineRule="exact" w:line="80"/>
-      </w:pPr>
-    </w:p>
-    <w:p>
-      <w:pPr>
-        <w:spacing w:before="0" w:after="0" w:lineRule="exact" w:line="80"/>
-      </w:pPr>
-    </w:p>
-    <w:p>
-      <w:pPr>
-        <w:spacing w:before="80" w:after="40"/>
-        <w:ind w:left="360" w:firstLine="0"/>
-      </w:pPr>
-      <w:r>
-        <w:rPr>
-          <w:rFonts w:ascii="Courier New" w:hAnsi="Courier New"/>
-          <w:b/>
-          <w:i w:val="0"/>
-          <w:color w:val="286E28"/>
-          <w:sz w:val="18"/>
-        </w:rPr>
-        <w:t>▶  TAPE C2-04</w:t>
-      </w:r>
-    </w:p>
-    <w:p>
-      <w:pPr>
-        <w:spacing w:before="0" w:after="120"/>
-        <w:ind w:left="360" w:firstLine="0"/>
-        <w:jc w:val="left"/>
-        <w:shd w:val="clear" w:color="auto" w:fill="F5EEE4"/>
-      </w:pPr>
-      <w:r>
-        <w:rPr>
-          <w:rFonts w:ascii="Courier New" w:hAnsi="Courier New"/>
-          <w:b w:val="0"/>
-          <w:i/>
-          <w:color w:val="334A22"/>
-          <w:sz w:val="21"/>
-        </w:rPr>
-        <w:t>"The sound triggers it. It cannot see. It only listens."</w:t>
-      </w:r>
-    </w:p>
-    <w:p>
-      <w:pPr>
-        <w:spacing w:before="0" w:after="0" w:lineRule="exact" w:line="80"/>
-      </w:pPr>
-    </w:p>
-    <w:p>
-      <w:pPr>
-        <w:spacing w:before="0" w:after="0" w:lineRule="exact" w:line="80"/>
-      </w:pPr>
-    </w:p>
-    <w:p>
-      <w:pPr>
-        <w:spacing w:before="80" w:after="40"/>
-        <w:ind w:left="360" w:firstLine="0"/>
-      </w:pPr>
-      <w:r>
-        <w:rPr>
-          <w:rFonts w:ascii="Courier New" w:hAnsi="Courier New"/>
-          <w:b/>
-          <w:i w:val="0"/>
-          <w:color w:val="286E28"/>
-          <w:sz w:val="18"/>
-        </w:rPr>
-        <w:t>▶  TAPE C2-06</w:t>
-      </w:r>
-    </w:p>
-    <w:p>
-      <w:pPr>
-        <w:spacing w:before="0" w:after="120"/>
-        <w:ind w:left="360" w:firstLine="0"/>
-        <w:jc w:val="left"/>
-        <w:shd w:val="clear" w:color="auto" w:fill="F5EEE4"/>
-      </w:pPr>
-      <w:r>
-        <w:rPr>
-          <w:rFonts w:ascii="Courier New" w:hAnsi="Courier New"/>
-          <w:b w:val="0"/>
-          <w:i/>
-          <w:color w:val="334A22"/>
-          <w:sz w:val="21"/>
-        </w:rPr>
-        <w:t>"Move slow. Stay quiet. You have a chance. —Vale"</w:t>
-      </w:r>
-    </w:p>
-    <w:p>
-      <w:pPr>
-        <w:spacing w:before="0" w:after="0" w:lineRule="exact" w:line="80"/>
-      </w:pPr>
-    </w:p>
-    <w:p>
-      <w:pPr>
-        <w:spacing w:before="0" w:after="160"/>
-        <w:ind w:firstLine="432"/>
-        <w:jc w:val="both"/>
-      </w:pPr>
-      <w:r>
-        <w:rPr>
-          <w:rFonts w:ascii="Garamond" w:hAnsi="Garamond"/>
-          <w:b w:val="0"/>
-          <w:i w:val="0"/>
-          <w:color w:val="221C12"/>
-          <w:sz w:val="24"/>
-        </w:rPr>
-        <w:t>Subject 47 — the last of the original workers — was confirmed as a distinct contained entity in the lowest level of the building: the Containment Core. It had been in that room for seven years. It was still waiting.</w:t>
-      </w:r>
-    </w:p>
-    <w:p>
-      <w:pPr>
-        <w:spacing w:before="0" w:after="0" w:lineRule="exact" w:line="80"/>
-      </w:pPr>
-    </w:p>
-    <w:p>
-      <w:pPr>
-        <w:spacing w:before="120" w:after="0"/>
-        <w:ind w:left="432" w:firstLine="0"/>
-        <w:jc w:val="right"/>
-      </w:pPr>
-      <w:r>
-        <w:rPr>
-          <w:rFonts w:ascii="Courier New" w:hAnsi="Courier New"/>
-          <w:b/>
-          <w:i w:val="0"/>
-          <w:smallCaps/>
-          <w:color w:val="8B1A1A"/>
-          <w:sz w:val="16"/>
-        </w:rPr>
-        <w:t>[ CORE LOG ]</w:t>
-      </w:r>
-    </w:p>
-    <w:p>
-      <w:pPr>
-        <w:spacing w:before="0" w:after="80"/>
-        <w:ind w:left="432" w:firstLine="0"/>
-        <w:pBdr>
-          <w:bottom w:val="single" w:sz="4" w:space="2" w:color="8A6E28"/>
-        </w:pBdr>
-      </w:pPr>
-      <w:r>
-        <w:rPr>
-          <w:rFonts w:ascii="Courier New" w:hAnsi="Courier New"/>
-          <w:b/>
-          <w:i w:val="0"/>
-          <w:color w:val="8A6E28"/>
-          <w:sz w:val="19"/>
-        </w:rPr>
-        <w:t>CORE LOG — FINAL ENTRY  |  DATE UNKNOWN</w:t>
-      </w:r>
-    </w:p>
-    <w:p>
-      <w:pPr>
-        <w:spacing w:before="0" w:after="40"/>
-        <w:ind w:left="432" w:firstLine="0"/>
-        <w:jc w:val="left"/>
-        <w:shd w:val="clear" w:color="auto" w:fill="F0EEE4"/>
-      </w:pPr>
-      <w:r>
-        <w:rPr>
-          <w:rFonts w:ascii="Courier New" w:hAnsi="Courier New"/>
-          <w:b w:val="0"/>
-          <w:i/>
-          <w:color w:val="443A22"/>
-          <w:sz w:val="20"/>
-        </w:rPr>
-        <w:t>Subject 47. Experiment 7. Day unknown.</w:t>
-      </w:r>
-    </w:p>
-    <w:p>
-      <w:pPr>
-        <w:spacing w:before="0" w:after="40"/>
-        <w:ind w:left="432" w:firstLine="0"/>
-        <w:jc w:val="left"/>
-        <w:shd w:val="clear" w:color="auto" w:fill="F0EEE4"/>
-      </w:pPr>
-      <w:r>
-        <w:rPr>
-          <w:rFonts w:ascii="Courier New" w:hAnsi="Courier New"/>
-          <w:b w:val="0"/>
-          <w:i/>
-          <w:color w:val="443A22"/>
-          <w:sz w:val="20"/>
-        </w:rPr>
-      </w:r>
-    </w:p>
-    <w:p>
-      <w:pPr>
-        <w:spacing w:before="0" w:after="40"/>
-        <w:ind w:left="432" w:firstLine="0"/>
-        <w:jc w:val="left"/>
-        <w:shd w:val="clear" w:color="auto" w:fill="F0EEE4"/>
-      </w:pPr>
-      <w:r>
-        <w:rPr>
-          <w:rFonts w:ascii="Courier New" w:hAnsi="Courier New"/>
-          <w:b w:val="0"/>
-          <w:i/>
-          <w:color w:val="443A22"/>
-          <w:sz w:val="20"/>
-        </w:rPr>
-        <w:t>The signal is no longer external.</w:t>
-      </w:r>
-    </w:p>
-    <w:p>
-      <w:pPr>
-        <w:spacing w:before="0" w:after="40"/>
-        <w:ind w:left="432" w:firstLine="0"/>
-        <w:jc w:val="left"/>
-        <w:shd w:val="clear" w:color="auto" w:fill="F0EEE4"/>
-      </w:pPr>
-      <w:r>
-        <w:rPr>
-          <w:rFonts w:ascii="Courier New" w:hAnsi="Courier New"/>
-          <w:b w:val="0"/>
-          <w:i/>
-          <w:color w:val="443A22"/>
-          <w:sz w:val="20"/>
-        </w:rPr>
-        <w:t>We confirmed it yesterday. It is inside the subjects.</w:t>
-      </w:r>
-    </w:p>
-    <w:p>
-      <w:pPr>
-        <w:spacing w:before="0" w:after="40"/>
-        <w:ind w:left="432" w:firstLine="0"/>
-        <w:jc w:val="left"/>
-        <w:shd w:val="clear" w:color="auto" w:fill="F0EEE4"/>
-      </w:pPr>
-      <w:r>
-        <w:rPr>
-          <w:rFonts w:ascii="Courier New" w:hAnsi="Courier New"/>
-          <w:b w:val="0"/>
-          <w:i/>
-          <w:color w:val="443A22"/>
-          <w:sz w:val="20"/>
-        </w:rPr>
-        <w:t>They are broadcasting it.</w:t>
-      </w:r>
-    </w:p>
-    <w:p>
-      <w:pPr>
-        <w:spacing w:before="0" w:after="40"/>
-        <w:ind w:left="432" w:firstLine="0"/>
-        <w:jc w:val="left"/>
-        <w:shd w:val="clear" w:color="auto" w:fill="F0EEE4"/>
-      </w:pPr>
-      <w:r>
-        <w:rPr>
-          <w:rFonts w:ascii="Courier New" w:hAnsi="Courier New"/>
-          <w:b w:val="0"/>
-          <w:i/>
-          <w:color w:val="443A22"/>
-          <w:sz w:val="20"/>
-        </w:rPr>
-      </w:r>
-    </w:p>
-    <w:p>
-      <w:pPr>
-        <w:spacing w:before="0" w:after="40"/>
-        <w:ind w:left="432" w:firstLine="0"/>
-        <w:jc w:val="left"/>
-        <w:shd w:val="clear" w:color="auto" w:fill="F0EEE4"/>
-      </w:pPr>
-      <w:r>
-        <w:rPr>
-          <w:rFonts w:ascii="Courier New" w:hAnsi="Courier New"/>
-          <w:b w:val="0"/>
-          <w:i/>
-          <w:color w:val="443A22"/>
-          <w:sz w:val="20"/>
-        </w:rPr>
-        <w:t>There is no transmitter. There never was.</w:t>
-      </w:r>
-    </w:p>
-    <w:p>
-      <w:pPr>
-        <w:spacing w:before="0" w:after="40"/>
-        <w:ind w:left="432" w:firstLine="0"/>
-        <w:jc w:val="left"/>
-        <w:shd w:val="clear" w:color="auto" w:fill="F0EEE4"/>
-      </w:pPr>
-      <w:r>
-        <w:rPr>
-          <w:rFonts w:ascii="Courier New" w:hAnsi="Courier New"/>
-          <w:b w:val="0"/>
-          <w:i/>
-          <w:color w:val="443A22"/>
-          <w:sz w:val="20"/>
-        </w:rPr>
-      </w:r>
-    </w:p>
-    <w:p>
-      <w:pPr>
-        <w:spacing w:before="0" w:after="40"/>
-        <w:ind w:left="432" w:firstLine="0"/>
-        <w:jc w:val="left"/>
-        <w:shd w:val="clear" w:color="auto" w:fill="F0EEE4"/>
-      </w:pPr>
-      <w:r>
-        <w:rPr>
-          <w:rFonts w:ascii="Courier New" w:hAnsi="Courier New"/>
-          <w:b w:val="0"/>
-          <w:i/>
-          <w:color w:val="443A22"/>
-          <w:sz w:val="20"/>
-        </w:rPr>
-        <w:t>The building did not contain the signal.</w:t>
-      </w:r>
-    </w:p>
-    <w:p>
-      <w:pPr>
-        <w:spacing w:before="0" w:after="40"/>
-        <w:ind w:left="432" w:firstLine="0"/>
-        <w:jc w:val="left"/>
-        <w:shd w:val="clear" w:color="auto" w:fill="F0EEE4"/>
-      </w:pPr>
-      <w:r>
-        <w:rPr>
-          <w:rFonts w:ascii="Courier New" w:hAnsi="Courier New"/>
-          <w:b w:val="0"/>
-          <w:i/>
-          <w:color w:val="443A22"/>
-          <w:sz w:val="20"/>
-        </w:rPr>
-        <w:t>The signal contained the building.</w:t>
-      </w:r>
-    </w:p>
-    <w:p>
-      <w:pPr>
-        <w:spacing w:before="0" w:after="0" w:lineRule="exact" w:line="80"/>
-      </w:pPr>
-    </w:p>
-    <w:p>
-      <w:r>
-        <w:br w:type="page"/>
-      </w:r>
-    </w:p>
-    <w:p>
-      <w:pPr>
-        <w:spacing w:before="720" w:after="80"/>
-        <w:jc w:val="center"/>
-      </w:pPr>
-      <w:r>
-        <w:rPr>
-          <w:rFonts w:ascii="Garamond" w:hAnsi="Garamond"/>
-          <w:b w:val="0"/>
-          <w:i w:val="0"/>
-          <w:color w:val="554E3A"/>
-          <w:sz w:val="22"/>
-        </w:rPr>
-        <w:t>— V —</w:t>
-      </w:r>
-    </w:p>
-    <w:p>
-      <w:pPr>
-        <w:spacing w:before="80" w:after="120"/>
-        <w:jc w:val="center"/>
-        <w:pBdr>
-          <w:bottom w:val="single" w:sz="8" w:space="6" w:color="B8983C"/>
-        </w:pBdr>
-      </w:pPr>
-      <w:r>
-        <w:rPr>
-          <w:rFonts w:ascii="Garamond" w:hAnsi="Garamond"/>
-          <w:b/>
-          <w:i w:val="0"/>
-          <w:color w:val="B8983C"/>
-          <w:sz w:val="40"/>
-        </w:rPr>
         <w:t>DETECTIVE HARRIS</w:t>
       </w:r>
     </w:p>
@@ -3320,7 +2662,7 @@
           <w:color w:val="554E3A"/>
           <w:sz w:val="22"/>
         </w:rPr>
-        <w:t>— VI —</w:t>
+        <w:t>— V —</w:t>
       </w:r>
     </w:p>
     <w:p>
@@ -3637,7 +2979,7 @@
           <w:color w:val="554E3A"/>
           <w:sz w:val="22"/>
         </w:rPr>
-        <w:t>— VII —</w:t>
+        <w:t>— VI —</w:t>
       </w:r>
     </w:p>
     <w:p>
@@ -3984,7 +3326,7 @@
           <w:color w:val="554E3A"/>
           <w:sz w:val="22"/>
         </w:rPr>
-        <w:t>— VIII —</w:t>
+        <w:t>— VII —</w:t>
       </w:r>
     </w:p>
     <w:p>

</xml_diff>

<commit_message>
Add Harris floor-by-floor field recordings to Chapters V-VI, final scream to VII
Harris now documents his investigation in his own terrified voice across all five
floors. Entities emerge only through his subjective perception. Chapter VI C2
recording captures the silence mechanic in written form. Chapter VII recording 06
ends mid-scream — the device does not stop cleanly.

Co-Authored-By: Claude Sonnet 4.6 <noreply@anthropic.com>
</commit_message>
<xml_diff>
--- a/Case File 1994 — Story.docx
+++ b/Case File 1994 — Story.docx
@@ -2714,42 +2714,248 @@
           <w:color w:val="221C12"/>
           <w:sz w:val="24"/>
         </w:rPr>
-        <w:t>What Harris found inside defied every assumption in his case notes. The building had not decayed in the normal sense. It was occupied — not by squatters, not by wildlife — by something that moved with intention. That tracked. That learned. That blocked exit points.</w:t>
-      </w:r>
-    </w:p>
-    <w:p>
-      <w:pPr>
-        <w:spacing w:before="0" w:after="160"/>
-        <w:ind w:firstLine="432"/>
-        <w:jc w:val="both"/>
+        <w:t>What follows are Harris's personal audio recordings, recovered from his field device. They are reproduced here in sequence.</w:t>
+      </w:r>
+    </w:p>
+    <w:p>
+      <w:pPr>
+        <w:spacing w:before="0" w:after="0" w:lineRule="exact" w:line="80"/>
+      </w:pPr>
+    </w:p>
+    <w:p>
+      <w:pPr>
+        <w:spacing w:before="120" w:after="80"/>
+        <w:ind w:left="360" w:firstLine="0"/>
+        <w:pBdr>
+          <w:bottom w:val="single" w:sz="4" w:space="2" w:color="2C3E7A"/>
+        </w:pBdr>
+      </w:pPr>
+      <w:r>
+        <w:rPr>
+          <w:rFonts w:ascii="Courier New" w:hAnsi="Courier New"/>
+          <w:b/>
+          <w:i w:val="0"/>
+          <w:smallCaps/>
+          <w:color w:val="2C3E7A"/>
+          <w:sz w:val="18"/>
+        </w:rPr>
+        <w:t>HARRIS — FIELD RECORDING 01  |  ARCHIVE FLOOR — LEVEL 1  |  NOV 5, 1994</w:t>
+      </w:r>
+    </w:p>
+    <w:p>
+      <w:pPr>
+        <w:spacing w:before="0" w:after="80"/>
+        <w:ind w:left="360" w:firstLine="0"/>
+        <w:jc w:val="left"/>
+        <w:shd w:val="clear" w:color="auto" w:fill="EEF0F8"/>
       </w:pPr>
       <w:r>
         <w:rPr>
           <w:rFonts w:ascii="Garamond" w:hAnsi="Garamond"/>
           <w:b w:val="0"/>
-          <w:i w:val="0"/>
-          <w:color w:val="221C12"/>
-          <w:sz w:val="24"/>
-        </w:rPr>
-        <w:t>Scattered across five floors were eleven evidence tapes and a series of sealed documents, each encoding a fragment of the truth. The researchers who had placed them there understood what was happening and had left behind the only thing they could: a cipher. A way out for anyone who came after them.</w:t>
-      </w:r>
-    </w:p>
-    <w:p>
-      <w:pPr>
-        <w:spacing w:before="0" w:after="160"/>
-        <w:ind w:firstLine="432"/>
-        <w:jc w:val="both"/>
+          <w:i/>
+          <w:color w:val="2A3055"/>
+          <w:sz w:val="22"/>
+        </w:rPr>
+        <w:t>Inside. The door sealed behind me — didn't hear it until it was done. Archive Floor. Filing cabinets everywhere, most pulled open. Someone went through these in a hurry a long time ago.</w:t>
+      </w:r>
+    </w:p>
+    <w:p>
+      <w:pPr>
+        <w:spacing w:before="0" w:after="80"/>
+        <w:ind w:left="360" w:firstLine="0"/>
+        <w:jc w:val="left"/>
+        <w:shd w:val="clear" w:color="auto" w:fill="EEF0F8"/>
       </w:pPr>
       <w:r>
         <w:rPr>
           <w:rFonts w:ascii="Garamond" w:hAnsi="Garamond"/>
           <w:b w:val="0"/>
-          <w:i w:val="0"/>
-          <w:color w:val="221C12"/>
-          <w:sz w:val="24"/>
-        </w:rPr>
-        <w:t>Each tape held a clue. Each clue was a letter pair. Together they decoded the word that unlocked each floor's sealed exit.</w:t>
-      </w:r>
+          <w:i/>
+          <w:color w:val="2A3055"/>
+          <w:sz w:val="22"/>
+        </w:rPr>
+      </w:r>
+    </w:p>
+    <w:p>
+      <w:pPr>
+        <w:spacing w:before="0" w:after="80"/>
+        <w:ind w:left="360" w:firstLine="0"/>
+        <w:jc w:val="left"/>
+        <w:shd w:val="clear" w:color="auto" w:fill="EEF0F8"/>
+      </w:pPr>
+      <w:r>
+        <w:rPr>
+          <w:rFonts w:ascii="Garamond" w:hAnsi="Garamond"/>
+          <w:b w:val="0"/>
+          <w:i/>
+          <w:color w:val="2A3055"/>
+          <w:sz w:val="22"/>
+        </w:rPr>
+        <w:t>Found a tape recorder on a desk. Still works. Going to use it. If something happens, someone should know I was here.</w:t>
+      </w:r>
+    </w:p>
+    <w:p>
+      <w:pPr>
+        <w:spacing w:before="0" w:after="80"/>
+        <w:ind w:left="360" w:firstLine="0"/>
+        <w:jc w:val="left"/>
+        <w:shd w:val="clear" w:color="auto" w:fill="EEF0F8"/>
+      </w:pPr>
+      <w:r>
+        <w:rPr>
+          <w:rFonts w:ascii="Garamond" w:hAnsi="Garamond"/>
+          <w:b w:val="0"/>
+          <w:i/>
+          <w:color w:val="2A3055"/>
+          <w:sz w:val="22"/>
+        </w:rPr>
+      </w:r>
+    </w:p>
+    <w:p>
+      <w:pPr>
+        <w:spacing w:before="0" w:after="80"/>
+        <w:ind w:left="360" w:firstLine="0"/>
+        <w:jc w:val="left"/>
+        <w:shd w:val="clear" w:color="auto" w:fill="EEF0F8"/>
+      </w:pPr>
+      <w:r>
+        <w:rPr>
+          <w:rFonts w:ascii="Garamond" w:hAnsi="Garamond"/>
+          <w:b w:val="0"/>
+          <w:i/>
+          <w:color w:val="2A3055"/>
+          <w:sz w:val="22"/>
+        </w:rPr>
+        <w:t>Found my first researcher tape. They left a cipher. Something about the exit being frequency-locked. I don't fully understand it yet. I'll figure it out as I go.</w:t>
+      </w:r>
+    </w:p>
+    <w:p>
+      <w:pPr>
+        <w:spacing w:before="0" w:after="80"/>
+        <w:ind w:left="360" w:firstLine="0"/>
+        <w:jc w:val="left"/>
+        <w:shd w:val="clear" w:color="auto" w:fill="EEF0F8"/>
+      </w:pPr>
+      <w:r>
+        <w:rPr>
+          <w:rFonts w:ascii="Garamond" w:hAnsi="Garamond"/>
+          <w:b w:val="0"/>
+          <w:i/>
+          <w:color w:val="2A3055"/>
+          <w:sz w:val="22"/>
+        </w:rPr>
+      </w:r>
+    </w:p>
+    <w:p>
+      <w:pPr>
+        <w:spacing w:before="0" w:after="80"/>
+        <w:ind w:left="360" w:firstLine="0"/>
+        <w:jc w:val="left"/>
+        <w:shd w:val="clear" w:color="auto" w:fill="EEF0F8"/>
+      </w:pPr>
+      <w:r>
+        <w:rPr>
+          <w:rFonts w:ascii="Garamond" w:hAnsi="Garamond"/>
+          <w:b w:val="0"/>
+          <w:i/>
+          <w:color w:val="2A3055"/>
+          <w:sz w:val="22"/>
+        </w:rPr>
+        <w:t>There's a smell down here. Old paper. Something else. Something warm that has no business being in an empty building.</w:t>
+      </w:r>
+    </w:p>
+    <w:p>
+      <w:pPr>
+        <w:spacing w:before="0" w:after="80"/>
+        <w:ind w:left="360" w:firstLine="0"/>
+        <w:jc w:val="left"/>
+        <w:shd w:val="clear" w:color="auto" w:fill="EEF0F8"/>
+      </w:pPr>
+      <w:r>
+        <w:rPr>
+          <w:rFonts w:ascii="Garamond" w:hAnsi="Garamond"/>
+          <w:b w:val="0"/>
+          <w:i/>
+          <w:color w:val="2A3055"/>
+          <w:sz w:val="22"/>
+        </w:rPr>
+      </w:r>
+    </w:p>
+    <w:p>
+      <w:pPr>
+        <w:spacing w:before="0" w:after="80"/>
+        <w:ind w:left="360" w:firstLine="0"/>
+        <w:jc w:val="left"/>
+        <w:shd w:val="clear" w:color="auto" w:fill="EEF0F8"/>
+      </w:pPr>
+      <w:r>
+        <w:rPr>
+          <w:rFonts w:ascii="Garamond" w:hAnsi="Garamond"/>
+          <w:b w:val="0"/>
+          <w:i/>
+          <w:color w:val="2A3055"/>
+          <w:sz w:val="22"/>
+        </w:rPr>
+        <w:t>I heard something in the corridor behind me. I turned around. Nothing there. But the filing cabinet in the far corner — it was open when I arrived. It's closed now.</w:t>
+      </w:r>
+    </w:p>
+    <w:p>
+      <w:pPr>
+        <w:spacing w:before="0" w:after="80"/>
+        <w:ind w:left="360" w:firstLine="0"/>
+        <w:jc w:val="left"/>
+        <w:shd w:val="clear" w:color="auto" w:fill="EEF0F8"/>
+      </w:pPr>
+      <w:r>
+        <w:rPr>
+          <w:rFonts w:ascii="Garamond" w:hAnsi="Garamond"/>
+          <w:b w:val="0"/>
+          <w:i/>
+          <w:color w:val="2A3055"/>
+          <w:sz w:val="22"/>
+        </w:rPr>
+      </w:r>
+    </w:p>
+    <w:p>
+      <w:pPr>
+        <w:spacing w:before="0" w:after="80"/>
+        <w:ind w:left="360" w:firstLine="0"/>
+        <w:jc w:val="left"/>
+        <w:shd w:val="clear" w:color="auto" w:fill="EEF0F8"/>
+      </w:pPr>
+      <w:r>
+        <w:rPr>
+          <w:rFonts w:ascii="Garamond" w:hAnsi="Garamond"/>
+          <w:b w:val="0"/>
+          <w:i/>
+          <w:color w:val="2A3055"/>
+          <w:sz w:val="22"/>
+        </w:rPr>
+        <w:t>Moving on.</w:t>
+      </w:r>
+    </w:p>
+    <w:p>
+      <w:pPr>
+        <w:spacing w:before="80" w:after="80"/>
+        <w:ind w:left="360" w:firstLine="0"/>
+        <w:jc w:val="right"/>
+      </w:pPr>
+      <w:r>
+        <w:rPr>
+          <w:rFonts w:ascii="Garamond" w:hAnsi="Garamond"/>
+          <w:b w:val="0"/>
+          <w:i/>
+          <w:color w:val="2C3E7A"/>
+          <w:sz w:val="20"/>
+        </w:rPr>
+        <w:t>— S. Harris</w:t>
+      </w:r>
+    </w:p>
+    <w:p>
+      <w:pPr>
+        <w:spacing w:before="0" w:after="0" w:lineRule="exact" w:line="80"/>
+      </w:pPr>
     </w:p>
     <w:p>
       <w:pPr>
@@ -2769,7 +2975,7 @@
           <w:color w:val="286E28"/>
           <w:sz w:val="18"/>
         </w:rPr>
-        <w:t>▶  TAPE 010</w:t>
+        <w:t>▶  TAPE 001 — RECOVERED, ARCHIVE FLOOR</w:t>
       </w:r>
     </w:p>
     <w:p>
@@ -2787,7 +2993,610 @@
           <w:color w:val="334A22"/>
           <w:sz w:val="21"/>
         </w:rPr>
-        <w:t>"The researchers left a cipher. The exit is locked by frequency-code. It was designed so ONLY the signal could decode it."</w:t>
+        <w:t>"Day 1. Entrance sealed from inside. Lock broken inward. Something in here did not want to leave."</w:t>
+      </w:r>
+    </w:p>
+    <w:p>
+      <w:pPr>
+        <w:spacing w:before="0" w:after="0" w:lineRule="exact" w:line="80"/>
+      </w:pPr>
+    </w:p>
+    <w:p>
+      <w:pPr>
+        <w:spacing w:before="0" w:after="0" w:lineRule="exact" w:line="80"/>
+      </w:pPr>
+    </w:p>
+    <w:p>
+      <w:pPr>
+        <w:spacing w:before="120" w:after="80"/>
+        <w:ind w:left="360" w:firstLine="0"/>
+        <w:pBdr>
+          <w:bottom w:val="single" w:sz="4" w:space="2" w:color="2C3E7A"/>
+        </w:pBdr>
+      </w:pPr>
+      <w:r>
+        <w:rPr>
+          <w:rFonts w:ascii="Courier New" w:hAnsi="Courier New"/>
+          <w:b/>
+          <w:i w:val="0"/>
+          <w:smallCaps/>
+          <w:color w:val="2C3E7A"/>
+          <w:sz w:val="18"/>
+        </w:rPr>
+        <w:t>HARRIS — FIELD RECORDING 02  |  SUBLEVEL B1 — LEVEL 2  |  NOV 5, 1994</w:t>
+      </w:r>
+    </w:p>
+    <w:p>
+      <w:pPr>
+        <w:spacing w:before="0" w:after="80"/>
+        <w:ind w:left="360" w:firstLine="0"/>
+        <w:jc w:val="left"/>
+        <w:shd w:val="clear" w:color="auto" w:fill="EEF0F8"/>
+      </w:pPr>
+      <w:r>
+        <w:rPr>
+          <w:rFonts w:ascii="Garamond" w:hAnsi="Garamond"/>
+          <w:b w:val="0"/>
+          <w:i/>
+          <w:color w:val="2A3055"/>
+          <w:sz w:val="22"/>
+        </w:rPr>
+        <w:t>Made it to B1. The stairs going down are wrong — the light doesn't reach the bottom properly. It feels like the darkness has weight.</w:t>
+      </w:r>
+    </w:p>
+    <w:p>
+      <w:pPr>
+        <w:spacing w:before="0" w:after="80"/>
+        <w:ind w:left="360" w:firstLine="0"/>
+        <w:jc w:val="left"/>
+        <w:shd w:val="clear" w:color="auto" w:fill="EEF0F8"/>
+      </w:pPr>
+      <w:r>
+        <w:rPr>
+          <w:rFonts w:ascii="Garamond" w:hAnsi="Garamond"/>
+          <w:b w:val="0"/>
+          <w:i/>
+          <w:color w:val="2A3055"/>
+          <w:sz w:val="22"/>
+        </w:rPr>
+      </w:r>
+    </w:p>
+    <w:p>
+      <w:pPr>
+        <w:spacing w:before="0" w:after="80"/>
+        <w:ind w:left="360" w:firstLine="0"/>
+        <w:jc w:val="left"/>
+        <w:shd w:val="clear" w:color="auto" w:fill="EEF0F8"/>
+      </w:pPr>
+      <w:r>
+        <w:rPr>
+          <w:rFonts w:ascii="Garamond" w:hAnsi="Garamond"/>
+          <w:b w:val="0"/>
+          <w:i/>
+          <w:color w:val="2A3055"/>
+          <w:sz w:val="22"/>
+        </w:rPr>
+        <w:t>Found more tapes. Playing them carefully, keeping the volume low.</w:t>
+      </w:r>
+    </w:p>
+    <w:p>
+      <w:pPr>
+        <w:spacing w:before="0" w:after="80"/>
+        <w:ind w:left="360" w:firstLine="0"/>
+        <w:jc w:val="left"/>
+        <w:shd w:val="clear" w:color="auto" w:fill="EEF0F8"/>
+      </w:pPr>
+      <w:r>
+        <w:rPr>
+          <w:rFonts w:ascii="Garamond" w:hAnsi="Garamond"/>
+          <w:b w:val="0"/>
+          <w:i/>
+          <w:color w:val="2A3055"/>
+          <w:sz w:val="22"/>
+        </w:rPr>
+      </w:r>
+    </w:p>
+    <w:p>
+      <w:pPr>
+        <w:spacing w:before="0" w:after="80"/>
+        <w:ind w:left="360" w:firstLine="0"/>
+        <w:jc w:val="left"/>
+        <w:shd w:val="clear" w:color="auto" w:fill="EEF0F8"/>
+      </w:pPr>
+      <w:r>
+        <w:rPr>
+          <w:rFonts w:ascii="Garamond" w:hAnsi="Garamond"/>
+          <w:b w:val="0"/>
+          <w:i/>
+          <w:color w:val="2A3055"/>
+          <w:sz w:val="22"/>
+        </w:rPr>
+        <w:t>One of them — I need to write this down so I don't convince myself I imagined it — one of the tapes is in my voice. My voice. I have never been in this building. I would remember. I would remember.</w:t>
+      </w:r>
+    </w:p>
+    <w:p>
+      <w:pPr>
+        <w:spacing w:before="0" w:after="80"/>
+        <w:ind w:left="360" w:firstLine="0"/>
+        <w:jc w:val="left"/>
+        <w:shd w:val="clear" w:color="auto" w:fill="EEF0F8"/>
+      </w:pPr>
+      <w:r>
+        <w:rPr>
+          <w:rFonts w:ascii="Garamond" w:hAnsi="Garamond"/>
+          <w:b w:val="0"/>
+          <w:i/>
+          <w:color w:val="2A3055"/>
+          <w:sz w:val="22"/>
+        </w:rPr>
+      </w:r>
+    </w:p>
+    <w:p>
+      <w:pPr>
+        <w:spacing w:before="0" w:after="80"/>
+        <w:ind w:left="360" w:firstLine="0"/>
+        <w:jc w:val="left"/>
+        <w:shd w:val="clear" w:color="auto" w:fill="EEF0F8"/>
+      </w:pPr>
+      <w:r>
+        <w:rPr>
+          <w:rFonts w:ascii="Garamond" w:hAnsi="Garamond"/>
+          <w:b w:val="0"/>
+          <w:i/>
+          <w:color w:val="2A3055"/>
+          <w:sz w:val="22"/>
+        </w:rPr>
+        <w:t>I played it three times. It's mine.</w:t>
+      </w:r>
+    </w:p>
+    <w:p>
+      <w:pPr>
+        <w:spacing w:before="0" w:after="80"/>
+        <w:ind w:left="360" w:firstLine="0"/>
+        <w:jc w:val="left"/>
+        <w:shd w:val="clear" w:color="auto" w:fill="EEF0F8"/>
+      </w:pPr>
+      <w:r>
+        <w:rPr>
+          <w:rFonts w:ascii="Garamond" w:hAnsi="Garamond"/>
+          <w:b w:val="0"/>
+          <w:i/>
+          <w:color w:val="2A3055"/>
+          <w:sz w:val="22"/>
+        </w:rPr>
+      </w:r>
+    </w:p>
+    <w:p>
+      <w:pPr>
+        <w:spacing w:before="0" w:after="80"/>
+        <w:ind w:left="360" w:firstLine="0"/>
+        <w:jc w:val="left"/>
+        <w:shd w:val="clear" w:color="auto" w:fill="EEF0F8"/>
+      </w:pPr>
+      <w:r>
+        <w:rPr>
+          <w:rFonts w:ascii="Garamond" w:hAnsi="Garamond"/>
+          <w:b w:val="0"/>
+          <w:i/>
+          <w:color w:val="2A3055"/>
+          <w:sz w:val="22"/>
+        </w:rPr>
+        <w:t>There is something on this floor with me. I've seen it twice. At the end of corridors. At the very edge of my flashlight beam — tall, slow, wrong in a way I can't put into a report. It moves like it's listening to something I can't hear.</w:t>
+      </w:r>
+    </w:p>
+    <w:p>
+      <w:pPr>
+        <w:spacing w:before="0" w:after="80"/>
+        <w:ind w:left="360" w:firstLine="0"/>
+        <w:jc w:val="left"/>
+        <w:shd w:val="clear" w:color="auto" w:fill="EEF0F8"/>
+      </w:pPr>
+      <w:r>
+        <w:rPr>
+          <w:rFonts w:ascii="Garamond" w:hAnsi="Garamond"/>
+          <w:b w:val="0"/>
+          <w:i/>
+          <w:color w:val="2A3055"/>
+          <w:sz w:val="22"/>
+        </w:rPr>
+      </w:r>
+    </w:p>
+    <w:p>
+      <w:pPr>
+        <w:spacing w:before="0" w:after="80"/>
+        <w:ind w:left="360" w:firstLine="0"/>
+        <w:jc w:val="left"/>
+        <w:shd w:val="clear" w:color="auto" w:fill="EEF0F8"/>
+      </w:pPr>
+      <w:r>
+        <w:rPr>
+          <w:rFonts w:ascii="Garamond" w:hAnsi="Garamond"/>
+          <w:b w:val="0"/>
+          <w:i/>
+          <w:color w:val="2A3055"/>
+          <w:sz w:val="22"/>
+        </w:rPr>
+        <w:t>I pressed myself into a corner and didn't move for eleven minutes. I counted. It stood in the doorway. Didn't come in. Then it left.</w:t>
+      </w:r>
+    </w:p>
+    <w:p>
+      <w:pPr>
+        <w:spacing w:before="0" w:after="80"/>
+        <w:ind w:left="360" w:firstLine="0"/>
+        <w:jc w:val="left"/>
+        <w:shd w:val="clear" w:color="auto" w:fill="EEF0F8"/>
+      </w:pPr>
+      <w:r>
+        <w:rPr>
+          <w:rFonts w:ascii="Garamond" w:hAnsi="Garamond"/>
+          <w:b w:val="0"/>
+          <w:i/>
+          <w:color w:val="2A3055"/>
+          <w:sz w:val="22"/>
+        </w:rPr>
+      </w:r>
+    </w:p>
+    <w:p>
+      <w:pPr>
+        <w:spacing w:before="0" w:after="80"/>
+        <w:ind w:left="360" w:firstLine="0"/>
+        <w:jc w:val="left"/>
+        <w:shd w:val="clear" w:color="auto" w:fill="EEF0F8"/>
+      </w:pPr>
+      <w:r>
+        <w:rPr>
+          <w:rFonts w:ascii="Garamond" w:hAnsi="Garamond"/>
+          <w:b w:val="0"/>
+          <w:i/>
+          <w:color w:val="2A3055"/>
+          <w:sz w:val="22"/>
+        </w:rPr>
+        <w:t>I don't know why it didn't come in. I am not going to think too long about why.</w:t>
+      </w:r>
+    </w:p>
+    <w:p>
+      <w:pPr>
+        <w:spacing w:before="80" w:after="80"/>
+        <w:ind w:left="360" w:firstLine="0"/>
+        <w:jc w:val="right"/>
+      </w:pPr>
+      <w:r>
+        <w:rPr>
+          <w:rFonts w:ascii="Garamond" w:hAnsi="Garamond"/>
+          <w:b w:val="0"/>
+          <w:i/>
+          <w:color w:val="2C3E7A"/>
+          <w:sz w:val="20"/>
+        </w:rPr>
+        <w:t>— S. Harris</w:t>
+      </w:r>
+    </w:p>
+    <w:p>
+      <w:pPr>
+        <w:spacing w:before="0" w:after="0" w:lineRule="exact" w:line="80"/>
+      </w:pPr>
+    </w:p>
+    <w:p>
+      <w:pPr>
+        <w:spacing w:before="0" w:after="0" w:lineRule="exact" w:line="80"/>
+      </w:pPr>
+    </w:p>
+    <w:p>
+      <w:pPr>
+        <w:spacing w:before="80" w:after="40"/>
+        <w:ind w:left="360" w:firstLine="0"/>
+      </w:pPr>
+      <w:r>
+        <w:rPr>
+          <w:rFonts w:ascii="Courier New" w:hAnsi="Courier New"/>
+          <w:b/>
+          <w:i w:val="0"/>
+          <w:color w:val="8B1A1A"/>
+          <w:sz w:val="18"/>
+        </w:rPr>
+        <w:t>▶  TAPE 003 — CORRUPTED  |  TIMESTAMP: 1991-03-22</w:t>
+      </w:r>
+    </w:p>
+    <w:p>
+      <w:pPr>
+        <w:spacing w:before="0" w:after="120"/>
+        <w:ind w:left="360" w:firstLine="0"/>
+        <w:jc w:val="left"/>
+        <w:shd w:val="clear" w:color="auto" w:fill="F5E4E4"/>
+      </w:pPr>
+      <w:r>
+        <w:rPr>
+          <w:rFonts w:ascii="Courier New" w:hAnsi="Courier New"/>
+          <w:b w:val="0"/>
+          <w:i/>
+          <w:color w:val="6A2222"/>
+          <w:sz w:val="21"/>
+        </w:rPr>
+        <w:t>"This recording predates your investigation by three years. The voice on the tape is yours."</w:t>
+      </w:r>
+    </w:p>
+    <w:p>
+      <w:pPr>
+        <w:spacing w:before="0" w:after="0" w:lineRule="exact" w:line="80"/>
+      </w:pPr>
+    </w:p>
+    <w:p>
+      <w:pPr>
+        <w:spacing w:before="0" w:after="0" w:lineRule="exact" w:line="80"/>
+      </w:pPr>
+    </w:p>
+    <w:p>
+      <w:pPr>
+        <w:spacing w:before="80" w:after="40"/>
+        <w:ind w:left="360" w:firstLine="0"/>
+      </w:pPr>
+      <w:r>
+        <w:rPr>
+          <w:rFonts w:ascii="Courier New" w:hAnsi="Courier New"/>
+          <w:b/>
+          <w:i w:val="0"/>
+          <w:color w:val="8B1A1A"/>
+          <w:sz w:val="18"/>
+        </w:rPr>
+        <w:t>▶  TAPE 009 — CORRUPTED</w:t>
+      </w:r>
+    </w:p>
+    <w:p>
+      <w:pPr>
+        <w:spacing w:before="0" w:after="120"/>
+        <w:ind w:left="360" w:firstLine="0"/>
+        <w:jc w:val="left"/>
+        <w:shd w:val="clear" w:color="auto" w:fill="F5E4E4"/>
+      </w:pPr>
+      <w:r>
+        <w:rPr>
+          <w:rFonts w:ascii="Courier New" w:hAnsi="Courier New"/>
+          <w:b w:val="0"/>
+          <w:i/>
+          <w:color w:val="6A2222"/>
+          <w:sz w:val="21"/>
+        </w:rPr>
+        <w:t>"You — Detective — this is a message from yourself. Three months from now. Do not look at it. Do not—"</w:t>
+      </w:r>
+    </w:p>
+    <w:p>
+      <w:pPr>
+        <w:spacing w:before="0" w:after="0" w:lineRule="exact" w:line="80"/>
+      </w:pPr>
+    </w:p>
+    <w:p>
+      <w:pPr>
+        <w:spacing w:before="0" w:after="0" w:lineRule="exact" w:line="80"/>
+      </w:pPr>
+    </w:p>
+    <w:p>
+      <w:pPr>
+        <w:spacing w:before="120" w:after="80"/>
+        <w:ind w:left="360" w:firstLine="0"/>
+        <w:pBdr>
+          <w:bottom w:val="single" w:sz="4" w:space="2" w:color="2C3E7A"/>
+        </w:pBdr>
+      </w:pPr>
+      <w:r>
+        <w:rPr>
+          <w:rFonts w:ascii="Courier New" w:hAnsi="Courier New"/>
+          <w:b/>
+          <w:i w:val="0"/>
+          <w:smallCaps/>
+          <w:color w:val="2C3E7A"/>
+          <w:sz w:val="18"/>
+        </w:rPr>
+        <w:t>HARRIS — FIELD RECORDING 03  |  SUBLEVEL B3 — LEVEL 3  |  NOV 6, 1994</w:t>
+      </w:r>
+    </w:p>
+    <w:p>
+      <w:pPr>
+        <w:spacing w:before="0" w:after="80"/>
+        <w:ind w:left="360" w:firstLine="0"/>
+        <w:jc w:val="left"/>
+        <w:shd w:val="clear" w:color="auto" w:fill="EEF0F8"/>
+      </w:pPr>
+      <w:r>
+        <w:rPr>
+          <w:rFonts w:ascii="Garamond" w:hAnsi="Garamond"/>
+          <w:b w:val="0"/>
+          <w:i/>
+          <w:color w:val="2A3055"/>
+          <w:sz w:val="22"/>
+        </w:rPr>
+        <w:t>B3. Containment zone. I can feel the depth of it — the building goes further down than the blueprints show. Found the incident log. 47 names. They all have the same personnel photo. Different names, same face. Whoever they were before, they became something else.</w:t>
+      </w:r>
+    </w:p>
+    <w:p>
+      <w:pPr>
+        <w:spacing w:before="0" w:after="80"/>
+        <w:ind w:left="360" w:firstLine="0"/>
+        <w:jc w:val="left"/>
+        <w:shd w:val="clear" w:color="auto" w:fill="EEF0F8"/>
+      </w:pPr>
+      <w:r>
+        <w:rPr>
+          <w:rFonts w:ascii="Garamond" w:hAnsi="Garamond"/>
+          <w:b w:val="0"/>
+          <w:i/>
+          <w:color w:val="2A3055"/>
+          <w:sz w:val="22"/>
+        </w:rPr>
+      </w:r>
+    </w:p>
+    <w:p>
+      <w:pPr>
+        <w:spacing w:before="0" w:after="80"/>
+        <w:ind w:left="360" w:firstLine="0"/>
+        <w:jc w:val="left"/>
+        <w:shd w:val="clear" w:color="auto" w:fill="EEF0F8"/>
+      </w:pPr>
+      <w:r>
+        <w:rPr>
+          <w:rFonts w:ascii="Garamond" w:hAnsi="Garamond"/>
+          <w:b w:val="0"/>
+          <w:i/>
+          <w:color w:val="2A3055"/>
+          <w:sz w:val="22"/>
+        </w:rPr>
+        <w:t>Found a document sealed inside a wall. Someone hid it inside the actual wall. A note dated 1987: "If you are reading this inside the building, you were never meant to leave either."</w:t>
+      </w:r>
+    </w:p>
+    <w:p>
+      <w:pPr>
+        <w:spacing w:before="0" w:after="80"/>
+        <w:ind w:left="360" w:firstLine="0"/>
+        <w:jc w:val="left"/>
+        <w:shd w:val="clear" w:color="auto" w:fill="EEF0F8"/>
+      </w:pPr>
+      <w:r>
+        <w:rPr>
+          <w:rFonts w:ascii="Garamond" w:hAnsi="Garamond"/>
+          <w:b w:val="0"/>
+          <w:i/>
+          <w:color w:val="2A3055"/>
+          <w:sz w:val="22"/>
+        </w:rPr>
+      </w:r>
+    </w:p>
+    <w:p>
+      <w:pPr>
+        <w:spacing w:before="0" w:after="80"/>
+        <w:ind w:left="360" w:firstLine="0"/>
+        <w:jc w:val="left"/>
+        <w:shd w:val="clear" w:color="auto" w:fill="EEF0F8"/>
+      </w:pPr>
+      <w:r>
+        <w:rPr>
+          <w:rFonts w:ascii="Garamond" w:hAnsi="Garamond"/>
+          <w:b w:val="0"/>
+          <w:i/>
+          <w:color w:val="2A3055"/>
+          <w:sz w:val="22"/>
+        </w:rPr>
+        <w:t>I am reading it inside the building.</w:t>
+      </w:r>
+    </w:p>
+    <w:p>
+      <w:pPr>
+        <w:spacing w:before="0" w:after="80"/>
+        <w:ind w:left="360" w:firstLine="0"/>
+        <w:jc w:val="left"/>
+        <w:shd w:val="clear" w:color="auto" w:fill="EEF0F8"/>
+      </w:pPr>
+      <w:r>
+        <w:rPr>
+          <w:rFonts w:ascii="Garamond" w:hAnsi="Garamond"/>
+          <w:b w:val="0"/>
+          <w:i/>
+          <w:color w:val="2A3055"/>
+          <w:sz w:val="22"/>
+        </w:rPr>
+      </w:r>
+    </w:p>
+    <w:p>
+      <w:pPr>
+        <w:spacing w:before="0" w:after="80"/>
+        <w:ind w:left="360" w:firstLine="0"/>
+        <w:jc w:val="left"/>
+        <w:shd w:val="clear" w:color="auto" w:fill="EEF0F8"/>
+      </w:pPr>
+      <w:r>
+        <w:rPr>
+          <w:rFonts w:ascii="Garamond" w:hAnsi="Garamond"/>
+          <w:b w:val="0"/>
+          <w:i/>
+          <w:color w:val="2A3055"/>
+          <w:sz w:val="22"/>
+        </w:rPr>
+        <w:t>The thing from Level 1 — I think it's been on every floor. I think it follows me between levels. I've stopped looking at it directly. I don't know why that feels important. It just does. Something about looking at it directly feels like an invitation.</w:t>
+      </w:r>
+    </w:p>
+    <w:p>
+      <w:pPr>
+        <w:spacing w:before="0" w:after="80"/>
+        <w:ind w:left="360" w:firstLine="0"/>
+        <w:jc w:val="left"/>
+        <w:shd w:val="clear" w:color="auto" w:fill="EEF0F8"/>
+      </w:pPr>
+      <w:r>
+        <w:rPr>
+          <w:rFonts w:ascii="Garamond" w:hAnsi="Garamond"/>
+          <w:b w:val="0"/>
+          <w:i/>
+          <w:color w:val="2A3055"/>
+          <w:sz w:val="22"/>
+        </w:rPr>
+      </w:r>
+    </w:p>
+    <w:p>
+      <w:pPr>
+        <w:spacing w:before="0" w:after="80"/>
+        <w:ind w:left="360" w:firstLine="0"/>
+        <w:jc w:val="left"/>
+        <w:shd w:val="clear" w:color="auto" w:fill="EEF0F8"/>
+      </w:pPr>
+      <w:r>
+        <w:rPr>
+          <w:rFonts w:ascii="Garamond" w:hAnsi="Garamond"/>
+          <w:b w:val="0"/>
+          <w:i/>
+          <w:color w:val="2A3055"/>
+          <w:sz w:val="22"/>
+        </w:rPr>
+        <w:t>I decoded the cipher on this floor. The exit unlocked. The word was ESCAPE. I don't find that funny.</w:t>
+      </w:r>
+    </w:p>
+    <w:p>
+      <w:pPr>
+        <w:spacing w:before="0" w:after="80"/>
+        <w:ind w:left="360" w:firstLine="0"/>
+        <w:jc w:val="left"/>
+        <w:shd w:val="clear" w:color="auto" w:fill="EEF0F8"/>
+      </w:pPr>
+      <w:r>
+        <w:rPr>
+          <w:rFonts w:ascii="Garamond" w:hAnsi="Garamond"/>
+          <w:b w:val="0"/>
+          <w:i/>
+          <w:color w:val="2A3055"/>
+          <w:sz w:val="22"/>
+        </w:rPr>
+      </w:r>
+    </w:p>
+    <w:p>
+      <w:pPr>
+        <w:spacing w:before="0" w:after="80"/>
+        <w:ind w:left="360" w:firstLine="0"/>
+        <w:jc w:val="left"/>
+        <w:shd w:val="clear" w:color="auto" w:fill="EEF0F8"/>
+      </w:pPr>
+      <w:r>
+        <w:rPr>
+          <w:rFonts w:ascii="Garamond" w:hAnsi="Garamond"/>
+          <w:b w:val="0"/>
+          <w:i/>
+          <w:color w:val="2A3055"/>
+          <w:sz w:val="22"/>
+        </w:rPr>
+        <w:t>Going deeper.</w:t>
+      </w:r>
+    </w:p>
+    <w:p>
+      <w:pPr>
+        <w:spacing w:before="80" w:after="80"/>
+        <w:ind w:left="360" w:firstLine="0"/>
+        <w:jc w:val="right"/>
+      </w:pPr>
+      <w:r>
+        <w:rPr>
+          <w:rFonts w:ascii="Garamond" w:hAnsi="Garamond"/>
+          <w:b w:val="0"/>
+          <w:i/>
+          <w:color w:val="2C3E7A"/>
+          <w:sz w:val="20"/>
+        </w:rPr>
+        <w:t>— S. Harris</w:t>
       </w:r>
     </w:p>
     <w:p>
@@ -2813,7 +3622,7 @@
           <w:color w:val="286E28"/>
           <w:sz w:val="18"/>
         </w:rPr>
-        <w:t>▶  TAPE 011  [FINAL]</w:t>
+        <w:t>▶  TAPE 010 — RECOVERED, SUBLEVEL B3</w:t>
       </w:r>
     </w:p>
     <w:p>
@@ -2831,85 +3640,7 @@
           <w:color w:val="334A22"/>
           <w:sz w:val="21"/>
         </w:rPr>
-        <w:t>"You were never meant to leave. But the researchers left one way out. Find the cipher. Trust the clues. Run."</w:t>
-      </w:r>
-    </w:p>
-    <w:p>
-      <w:pPr>
-        <w:spacing w:before="0" w:after="0" w:lineRule="exact" w:line="80"/>
-      </w:pPr>
-    </w:p>
-    <w:p>
-      <w:pPr>
-        <w:spacing w:before="0" w:after="160"/>
-        <w:ind w:firstLine="432"/>
-        <w:jc w:val="both"/>
-      </w:pPr>
-      <w:r>
-        <w:rPr>
-          <w:rFonts w:ascii="Garamond" w:hAnsi="Garamond"/>
-          <w:b w:val="0"/>
-          <w:i w:val="0"/>
-          <w:color w:val="221C12"/>
-          <w:sz w:val="24"/>
-        </w:rPr>
-        <w:t>On the third floor, Harris recovered a tape predating his investigation by three years — a recording from 1991, in a voice that matched his own. He had no memory of making it. He had no memory of ever entering the Aldric Building before.</w:t>
-      </w:r>
-    </w:p>
-    <w:p>
-      <w:pPr>
-        <w:spacing w:before="0" w:after="160"/>
-        <w:ind w:firstLine="432"/>
-        <w:jc w:val="both"/>
-      </w:pPr>
-      <w:r>
-        <w:rPr>
-          <w:rFonts w:ascii="Garamond" w:hAnsi="Garamond"/>
-          <w:b w:val="0"/>
-          <w:i w:val="0"/>
-          <w:color w:val="221C12"/>
-          <w:sz w:val="24"/>
-        </w:rPr>
-        <w:t>He kept moving.</w:t>
-      </w:r>
-    </w:p>
-    <w:p>
-      <w:pPr>
-        <w:spacing w:before="0" w:after="0" w:lineRule="exact" w:line="80"/>
-      </w:pPr>
-    </w:p>
-    <w:p>
-      <w:pPr>
-        <w:spacing w:before="80" w:after="40"/>
-        <w:ind w:left="360" w:firstLine="0"/>
-      </w:pPr>
-      <w:r>
-        <w:rPr>
-          <w:rFonts w:ascii="Courier New" w:hAnsi="Courier New"/>
-          <w:b/>
-          <w:i w:val="0"/>
-          <w:color w:val="8B1A1A"/>
-          <w:sz w:val="18"/>
-        </w:rPr>
-        <w:t>▶  TAPE 009 — CORRUPTED</w:t>
-      </w:r>
-    </w:p>
-    <w:p>
-      <w:pPr>
-        <w:spacing w:before="0" w:after="120"/>
-        <w:ind w:left="360" w:firstLine="0"/>
-        <w:jc w:val="left"/>
-        <w:shd w:val="clear" w:color="auto" w:fill="F5E4E4"/>
-      </w:pPr>
-      <w:r>
-        <w:rPr>
-          <w:rFonts w:ascii="Courier New" w:hAnsi="Courier New"/>
-          <w:b w:val="0"/>
-          <w:i/>
-          <w:color w:val="6A2222"/>
-          <w:sz w:val="21"/>
-        </w:rPr>
-        <w:t>"You — Detective — this is a message from yourself. Three months from now. Do not look at it. Do not—"</w:t>
+        <w:t>"The researchers left a cipher. The exit is locked by frequency-code. It was designed so ONLY the signal could decode it."</w:t>
       </w:r>
     </w:p>
     <w:p>
@@ -2935,7 +3666,7 @@
           <w:color w:val="286E28"/>
           <w:sz w:val="18"/>
         </w:rPr>
-        <w:t>▶  TAPE CORE-06</w:t>
+        <w:t>▶  TAPE 011 — FINAL, SUBLEVEL B3</w:t>
       </w:r>
     </w:p>
     <w:p>
@@ -2953,7 +3684,7 @@
           <w:color w:val="334A22"/>
           <w:sz w:val="21"/>
         </w:rPr>
-        <w:t>"If you find this — I made it out. I think. —S.H."</w:t>
+        <w:t>"You were never meant to leave. But the researchers left one way out. Find the cipher. Trust the clues. Run."</w:t>
       </w:r>
     </w:p>
     <w:p>
@@ -3016,6 +3747,635 @@
         </w:rPr>
         <w:t>"There was never a transmitter."</w:t>
       </w:r>
+    </w:p>
+    <w:p>
+      <w:pPr>
+        <w:spacing w:before="0" w:after="0" w:lineRule="exact" w:line="80"/>
+      </w:pPr>
+    </w:p>
+    <w:p>
+      <w:pPr>
+        <w:spacing w:before="120" w:after="80"/>
+        <w:ind w:left="360" w:firstLine="0"/>
+        <w:pBdr>
+          <w:bottom w:val="single" w:sz="4" w:space="2" w:color="2C3E7A"/>
+        </w:pBdr>
+      </w:pPr>
+      <w:r>
+        <w:rPr>
+          <w:rFonts w:ascii="Courier New" w:hAnsi="Courier New"/>
+          <w:b/>
+          <w:i w:val="0"/>
+          <w:smallCaps/>
+          <w:color w:val="2C3E7A"/>
+          <w:sz w:val="18"/>
+        </w:rPr>
+        <w:t>HARRIS — FIELD RECORDING 04  |  SUBLEVEL C2 — LEVEL 4  |  NOV 6, 1994</w:t>
+      </w:r>
+    </w:p>
+    <w:p>
+      <w:pPr>
+        <w:spacing w:before="0" w:after="80"/>
+        <w:ind w:left="360" w:firstLine="0"/>
+        <w:jc w:val="left"/>
+        <w:shd w:val="clear" w:color="auto" w:fill="EEF0F8"/>
+      </w:pPr>
+      <w:r>
+        <w:rPr>
+          <w:rFonts w:ascii="Garamond" w:hAnsi="Garamond"/>
+          <w:b w:val="0"/>
+          <w:i/>
+          <w:color w:val="2A3055"/>
+          <w:sz w:val="22"/>
+        </w:rPr>
+        <w:t>[whispered] C2. Can't speak above a whisper. There's something on this floor that finds you by sound. I don't mean footsteps. I mean any sound. Breathing. The rustle of a jacket. I've been moving in near-silence for — I don't know how long. My watch stopped.</w:t>
+      </w:r>
+    </w:p>
+    <w:p>
+      <w:pPr>
+        <w:spacing w:before="0" w:after="80"/>
+        <w:ind w:left="360" w:firstLine="0"/>
+        <w:jc w:val="left"/>
+        <w:shd w:val="clear" w:color="auto" w:fill="EEF0F8"/>
+      </w:pPr>
+      <w:r>
+        <w:rPr>
+          <w:rFonts w:ascii="Garamond" w:hAnsi="Garamond"/>
+          <w:b w:val="0"/>
+          <w:i/>
+          <w:color w:val="2A3055"/>
+          <w:sz w:val="22"/>
+        </w:rPr>
+      </w:r>
+    </w:p>
+    <w:p>
+      <w:pPr>
+        <w:spacing w:before="0" w:after="80"/>
+        <w:ind w:left="360" w:firstLine="0"/>
+        <w:jc w:val="left"/>
+        <w:shd w:val="clear" w:color="auto" w:fill="EEF0F8"/>
+      </w:pPr>
+      <w:r>
+        <w:rPr>
+          <w:rFonts w:ascii="Garamond" w:hAnsi="Garamond"/>
+          <w:b w:val="0"/>
+          <w:i/>
+          <w:color w:val="2A3055"/>
+          <w:sz w:val="22"/>
+        </w:rPr>
+        <w:t>Found tapes but I'm not playing them here. Reading the labels only. One of them says: "it hears heartbeats at close range." I believe it. I have been holding my breath until I see spots.</w:t>
+      </w:r>
+    </w:p>
+    <w:p>
+      <w:pPr>
+        <w:spacing w:before="0" w:after="80"/>
+        <w:ind w:left="360" w:firstLine="0"/>
+        <w:jc w:val="left"/>
+        <w:shd w:val="clear" w:color="auto" w:fill="EEF0F8"/>
+      </w:pPr>
+      <w:r>
+        <w:rPr>
+          <w:rFonts w:ascii="Garamond" w:hAnsi="Garamond"/>
+          <w:b w:val="0"/>
+          <w:i/>
+          <w:color w:val="2A3055"/>
+          <w:sz w:val="22"/>
+        </w:rPr>
+      </w:r>
+    </w:p>
+    <w:p>
+      <w:pPr>
+        <w:spacing w:before="0" w:after="80"/>
+        <w:ind w:left="360" w:firstLine="0"/>
+        <w:jc w:val="left"/>
+        <w:shd w:val="clear" w:color="auto" w:fill="EEF0F8"/>
+      </w:pPr>
+      <w:r>
+        <w:rPr>
+          <w:rFonts w:ascii="Garamond" w:hAnsi="Garamond"/>
+          <w:b w:val="0"/>
+          <w:i/>
+          <w:color w:val="2A3055"/>
+          <w:sz w:val="22"/>
+        </w:rPr>
+        <w:t>It's standing in the dark about thirty feet from me right now. It hasn't moved in six minutes. I can't tell if it's waiting for something or if it simply — exists there. Like it belongs to the dark the way furniture belongs to a room.</w:t>
+      </w:r>
+    </w:p>
+    <w:p>
+      <w:pPr>
+        <w:spacing w:before="0" w:after="80"/>
+        <w:ind w:left="360" w:firstLine="0"/>
+        <w:jc w:val="left"/>
+        <w:shd w:val="clear" w:color="auto" w:fill="EEF0F8"/>
+      </w:pPr>
+      <w:r>
+        <w:rPr>
+          <w:rFonts w:ascii="Garamond" w:hAnsi="Garamond"/>
+          <w:b w:val="0"/>
+          <w:i/>
+          <w:color w:val="2A3055"/>
+          <w:sz w:val="22"/>
+        </w:rPr>
+      </w:r>
+    </w:p>
+    <w:p>
+      <w:pPr>
+        <w:spacing w:before="0" w:after="80"/>
+        <w:ind w:left="360" w:firstLine="0"/>
+        <w:jc w:val="left"/>
+        <w:shd w:val="clear" w:color="auto" w:fill="EEF0F8"/>
+      </w:pPr>
+      <w:r>
+        <w:rPr>
+          <w:rFonts w:ascii="Garamond" w:hAnsi="Garamond"/>
+          <w:b w:val="0"/>
+          <w:i/>
+          <w:color w:val="2A3055"/>
+          <w:sz w:val="22"/>
+        </w:rPr>
+        <w:t>I'm going to move. Very slowly. I'm going to —</w:t>
+      </w:r>
+    </w:p>
+    <w:p>
+      <w:pPr>
+        <w:spacing w:before="0" w:after="80"/>
+        <w:ind w:left="360" w:firstLine="0"/>
+        <w:jc w:val="left"/>
+        <w:shd w:val="clear" w:color="auto" w:fill="EEF0F8"/>
+      </w:pPr>
+      <w:r>
+        <w:rPr>
+          <w:rFonts w:ascii="Garamond" w:hAnsi="Garamond"/>
+          <w:b w:val="0"/>
+          <w:i/>
+          <w:color w:val="2A3055"/>
+          <w:sz w:val="22"/>
+        </w:rPr>
+      </w:r>
+    </w:p>
+    <w:p>
+      <w:pPr>
+        <w:spacing w:before="0" w:after="80"/>
+        <w:ind w:left="360" w:firstLine="0"/>
+        <w:jc w:val="left"/>
+        <w:shd w:val="clear" w:color="auto" w:fill="EEF0F8"/>
+      </w:pPr>
+      <w:r>
+        <w:rPr>
+          <w:rFonts w:ascii="Garamond" w:hAnsi="Garamond"/>
+          <w:b w:val="0"/>
+          <w:i/>
+          <w:color w:val="2A3055"/>
+          <w:sz w:val="22"/>
+        </w:rPr>
+        <w:t>[Recording cuts. 4 minutes 17 seconds of silence. Then:]</w:t>
+      </w:r>
+    </w:p>
+    <w:p>
+      <w:pPr>
+        <w:spacing w:before="0" w:after="80"/>
+        <w:ind w:left="360" w:firstLine="0"/>
+        <w:jc w:val="left"/>
+        <w:shd w:val="clear" w:color="auto" w:fill="EEF0F8"/>
+      </w:pPr>
+      <w:r>
+        <w:rPr>
+          <w:rFonts w:ascii="Garamond" w:hAnsi="Garamond"/>
+          <w:b w:val="0"/>
+          <w:i/>
+          <w:color w:val="2A3055"/>
+          <w:sz w:val="22"/>
+        </w:rPr>
+      </w:r>
+    </w:p>
+    <w:p>
+      <w:pPr>
+        <w:spacing w:before="0" w:after="80"/>
+        <w:ind w:left="360" w:firstLine="0"/>
+        <w:jc w:val="left"/>
+        <w:shd w:val="clear" w:color="auto" w:fill="EEF0F8"/>
+      </w:pPr>
+      <w:r>
+        <w:rPr>
+          <w:rFonts w:ascii="Garamond" w:hAnsi="Garamond"/>
+          <w:b w:val="0"/>
+          <w:i/>
+          <w:color w:val="2A3055"/>
+          <w:sz w:val="22"/>
+        </w:rPr>
+        <w:t>Still alive. I don't know how. I don't think I want to know.</w:t>
+      </w:r>
+    </w:p>
+    <w:p>
+      <w:pPr>
+        <w:spacing w:before="0" w:after="80"/>
+        <w:ind w:left="360" w:firstLine="0"/>
+        <w:jc w:val="left"/>
+        <w:shd w:val="clear" w:color="auto" w:fill="EEF0F8"/>
+      </w:pPr>
+      <w:r>
+        <w:rPr>
+          <w:rFonts w:ascii="Garamond" w:hAnsi="Garamond"/>
+          <w:b w:val="0"/>
+          <w:i/>
+          <w:color w:val="2A3055"/>
+          <w:sz w:val="22"/>
+        </w:rPr>
+      </w:r>
+    </w:p>
+    <w:p>
+      <w:pPr>
+        <w:spacing w:before="0" w:after="80"/>
+        <w:ind w:left="360" w:firstLine="0"/>
+        <w:jc w:val="left"/>
+        <w:shd w:val="clear" w:color="auto" w:fill="EEF0F8"/>
+      </w:pPr>
+      <w:r>
+        <w:rPr>
+          <w:rFonts w:ascii="Garamond" w:hAnsi="Garamond"/>
+          <w:b w:val="0"/>
+          <w:i/>
+          <w:color w:val="2A3055"/>
+          <w:sz w:val="22"/>
+        </w:rPr>
+        <w:t>Exit decoded. The word was SIGNAL. I found the tape that had my voice on it — the one from 1991. I'm not going to play it again. I'm leaving it here.</w:t>
+      </w:r>
+    </w:p>
+    <w:p>
+      <w:pPr>
+        <w:spacing w:before="80" w:after="80"/>
+        <w:ind w:left="360" w:firstLine="0"/>
+        <w:jc w:val="right"/>
+      </w:pPr>
+      <w:r>
+        <w:rPr>
+          <w:rFonts w:ascii="Garamond" w:hAnsi="Garamond"/>
+          <w:b w:val="0"/>
+          <w:i/>
+          <w:color w:val="2C3E7A"/>
+          <w:sz w:val="20"/>
+        </w:rPr>
+        <w:t>— S. Harris</w:t>
+      </w:r>
+    </w:p>
+    <w:p>
+      <w:pPr>
+        <w:spacing w:before="0" w:after="0" w:lineRule="exact" w:line="80"/>
+      </w:pPr>
+    </w:p>
+    <w:p>
+      <w:pPr>
+        <w:spacing w:before="0" w:after="0" w:lineRule="exact" w:line="80"/>
+      </w:pPr>
+    </w:p>
+    <w:p>
+      <w:pPr>
+        <w:spacing w:before="120" w:after="80"/>
+        <w:ind w:left="360" w:firstLine="0"/>
+        <w:pBdr>
+          <w:bottom w:val="single" w:sz="4" w:space="2" w:color="2C3E7A"/>
+        </w:pBdr>
+      </w:pPr>
+      <w:r>
+        <w:rPr>
+          <w:rFonts w:ascii="Courier New" w:hAnsi="Courier New"/>
+          <w:b/>
+          <w:i w:val="0"/>
+          <w:smallCaps/>
+          <w:color w:val="2C3E7A"/>
+          <w:sz w:val="18"/>
+        </w:rPr>
+        <w:t>HARRIS — FIELD RECORDING 05  |  CONTAINMENT CORE — LEVEL 5  |  NOV 7, 1994</w:t>
+      </w:r>
+    </w:p>
+    <w:p>
+      <w:pPr>
+        <w:spacing w:before="0" w:after="80"/>
+        <w:ind w:left="360" w:firstLine="0"/>
+        <w:jc w:val="left"/>
+        <w:shd w:val="clear" w:color="auto" w:fill="EEF0F8"/>
+      </w:pPr>
+      <w:r>
+        <w:rPr>
+          <w:rFonts w:ascii="Garamond" w:hAnsi="Garamond"/>
+          <w:b w:val="0"/>
+          <w:i/>
+          <w:color w:val="2A3055"/>
+          <w:sz w:val="22"/>
+        </w:rPr>
+        <w:t>This is the last floor. I can feel it.</w:t>
+      </w:r>
+    </w:p>
+    <w:p>
+      <w:pPr>
+        <w:spacing w:before="0" w:after="80"/>
+        <w:ind w:left="360" w:firstLine="0"/>
+        <w:jc w:val="left"/>
+        <w:shd w:val="clear" w:color="auto" w:fill="EEF0F8"/>
+      </w:pPr>
+      <w:r>
+        <w:rPr>
+          <w:rFonts w:ascii="Garamond" w:hAnsi="Garamond"/>
+          <w:b w:val="0"/>
+          <w:i/>
+          <w:color w:val="2A3055"/>
+          <w:sz w:val="22"/>
+        </w:rPr>
+      </w:r>
+    </w:p>
+    <w:p>
+      <w:pPr>
+        <w:spacing w:before="0" w:after="80"/>
+        <w:ind w:left="360" w:firstLine="0"/>
+        <w:jc w:val="left"/>
+        <w:shd w:val="clear" w:color="auto" w:fill="EEF0F8"/>
+      </w:pPr>
+      <w:r>
+        <w:rPr>
+          <w:rFonts w:ascii="Garamond" w:hAnsi="Garamond"/>
+          <w:b w:val="0"/>
+          <w:i/>
+          <w:color w:val="2A3055"/>
+          <w:sz w:val="22"/>
+        </w:rPr>
+        <w:t>There's something in the air down here I can feel in my back teeth. A frequency. Not quite a sound. More like the memory of a sound that hasn't happened yet.</w:t>
+      </w:r>
+    </w:p>
+    <w:p>
+      <w:pPr>
+        <w:spacing w:before="0" w:after="80"/>
+        <w:ind w:left="360" w:firstLine="0"/>
+        <w:jc w:val="left"/>
+        <w:shd w:val="clear" w:color="auto" w:fill="EEF0F8"/>
+      </w:pPr>
+      <w:r>
+        <w:rPr>
+          <w:rFonts w:ascii="Garamond" w:hAnsi="Garamond"/>
+          <w:b w:val="0"/>
+          <w:i/>
+          <w:color w:val="2A3055"/>
+          <w:sz w:val="22"/>
+        </w:rPr>
+      </w:r>
+    </w:p>
+    <w:p>
+      <w:pPr>
+        <w:spacing w:before="0" w:after="80"/>
+        <w:ind w:left="360" w:firstLine="0"/>
+        <w:jc w:val="left"/>
+        <w:shd w:val="clear" w:color="auto" w:fill="EEF0F8"/>
+      </w:pPr>
+      <w:r>
+        <w:rPr>
+          <w:rFonts w:ascii="Garamond" w:hAnsi="Garamond"/>
+          <w:b w:val="0"/>
+          <w:i/>
+          <w:color w:val="2A3055"/>
+          <w:sz w:val="22"/>
+        </w:rPr>
+        <w:t>Found the final document. It's the one that explains everything. There is no transmitter. There never was. The workers — all 47 of them — they became the signal. They're still broadcasting. From inside the walls. From inside the floors. Everything I've encountered in this building — every corridor, every doorway, every thing standing just outside my flashlight's reach — that's them. What's left of them. Forty-seven people compressed into something that has no name.</w:t>
+      </w:r>
+    </w:p>
+    <w:p>
+      <w:pPr>
+        <w:spacing w:before="0" w:after="80"/>
+        <w:ind w:left="360" w:firstLine="0"/>
+        <w:jc w:val="left"/>
+        <w:shd w:val="clear" w:color="auto" w:fill="EEF0F8"/>
+      </w:pPr>
+      <w:r>
+        <w:rPr>
+          <w:rFonts w:ascii="Garamond" w:hAnsi="Garamond"/>
+          <w:b w:val="0"/>
+          <w:i/>
+          <w:color w:val="2A3055"/>
+          <w:sz w:val="22"/>
+        </w:rPr>
+      </w:r>
+    </w:p>
+    <w:p>
+      <w:pPr>
+        <w:spacing w:before="0" w:after="80"/>
+        <w:ind w:left="360" w:firstLine="0"/>
+        <w:jc w:val="left"/>
+        <w:shd w:val="clear" w:color="auto" w:fill="EEF0F8"/>
+      </w:pPr>
+      <w:r>
+        <w:rPr>
+          <w:rFonts w:ascii="Garamond" w:hAnsi="Garamond"/>
+          <w:b w:val="0"/>
+          <w:i/>
+          <w:color w:val="2A3055"/>
+          <w:sz w:val="22"/>
+        </w:rPr>
+        <w:t>And they've been waiting. Seven years. Waiting for someone to walk back in.</w:t>
+      </w:r>
+    </w:p>
+    <w:p>
+      <w:pPr>
+        <w:spacing w:before="0" w:after="80"/>
+        <w:ind w:left="360" w:firstLine="0"/>
+        <w:jc w:val="left"/>
+        <w:shd w:val="clear" w:color="auto" w:fill="EEF0F8"/>
+      </w:pPr>
+      <w:r>
+        <w:rPr>
+          <w:rFonts w:ascii="Garamond" w:hAnsi="Garamond"/>
+          <w:b w:val="0"/>
+          <w:i/>
+          <w:color w:val="2A3055"/>
+          <w:sz w:val="22"/>
+        </w:rPr>
+      </w:r>
+    </w:p>
+    <w:p>
+      <w:pPr>
+        <w:spacing w:before="0" w:after="80"/>
+        <w:ind w:left="360" w:firstLine="0"/>
+        <w:jc w:val="left"/>
+        <w:shd w:val="clear" w:color="auto" w:fill="EEF0F8"/>
+      </w:pPr>
+      <w:r>
+        <w:rPr>
+          <w:rFonts w:ascii="Garamond" w:hAnsi="Garamond"/>
+          <w:b w:val="0"/>
+          <w:i/>
+          <w:color w:val="2A3055"/>
+          <w:sz w:val="22"/>
+        </w:rPr>
+        <w:t>The anonymous tip — the voice on the recording — it was mine. I don't remember sending it. I don't remember any of this place. But I knew where it was. I've always known. Something in me has always known.</w:t>
+      </w:r>
+    </w:p>
+    <w:p>
+      <w:pPr>
+        <w:spacing w:before="0" w:after="80"/>
+        <w:ind w:left="360" w:firstLine="0"/>
+        <w:jc w:val="left"/>
+        <w:shd w:val="clear" w:color="auto" w:fill="EEF0F8"/>
+      </w:pPr>
+      <w:r>
+        <w:rPr>
+          <w:rFonts w:ascii="Garamond" w:hAnsi="Garamond"/>
+          <w:b w:val="0"/>
+          <w:i/>
+          <w:color w:val="2A3055"/>
+          <w:sz w:val="22"/>
+        </w:rPr>
+      </w:r>
+    </w:p>
+    <w:p>
+      <w:pPr>
+        <w:spacing w:before="0" w:after="80"/>
+        <w:ind w:left="360" w:firstLine="0"/>
+        <w:jc w:val="left"/>
+        <w:shd w:val="clear" w:color="auto" w:fill="EEF0F8"/>
+      </w:pPr>
+      <w:r>
+        <w:rPr>
+          <w:rFonts w:ascii="Garamond" w:hAnsi="Garamond"/>
+          <w:b w:val="0"/>
+          <w:i/>
+          <w:color w:val="2A3055"/>
+          <w:sz w:val="22"/>
+        </w:rPr>
+        <w:t>I think I've been here before. I think that's what the 1991 tape is. I think I came here, and I found all of this, and I didn't make it out, and something sent me back — sent a version of my voice back — to do it again.</w:t>
+      </w:r>
+    </w:p>
+    <w:p>
+      <w:pPr>
+        <w:spacing w:before="0" w:after="80"/>
+        <w:ind w:left="360" w:firstLine="0"/>
+        <w:jc w:val="left"/>
+        <w:shd w:val="clear" w:color="auto" w:fill="EEF0F8"/>
+      </w:pPr>
+      <w:r>
+        <w:rPr>
+          <w:rFonts w:ascii="Garamond" w:hAnsi="Garamond"/>
+          <w:b w:val="0"/>
+          <w:i/>
+          <w:color w:val="2A3055"/>
+          <w:sz w:val="22"/>
+        </w:rPr>
+      </w:r>
+    </w:p>
+    <w:p>
+      <w:pPr>
+        <w:spacing w:before="0" w:after="80"/>
+        <w:ind w:left="360" w:firstLine="0"/>
+        <w:jc w:val="left"/>
+        <w:shd w:val="clear" w:color="auto" w:fill="EEF0F8"/>
+      </w:pPr>
+      <w:r>
+        <w:rPr>
+          <w:rFonts w:ascii="Garamond" w:hAnsi="Garamond"/>
+          <w:b w:val="0"/>
+          <w:i/>
+          <w:color w:val="2A3055"/>
+          <w:sz w:val="22"/>
+        </w:rPr>
+        <w:t>The exit is to the east. The cipher decoded. The word is SUBJECT.</w:t>
+      </w:r>
+    </w:p>
+    <w:p>
+      <w:pPr>
+        <w:spacing w:before="0" w:after="80"/>
+        <w:ind w:left="360" w:firstLine="0"/>
+        <w:jc w:val="left"/>
+        <w:shd w:val="clear" w:color="auto" w:fill="EEF0F8"/>
+      </w:pPr>
+      <w:r>
+        <w:rPr>
+          <w:rFonts w:ascii="Garamond" w:hAnsi="Garamond"/>
+          <w:b w:val="0"/>
+          <w:i/>
+          <w:color w:val="2A3055"/>
+          <w:sz w:val="22"/>
+        </w:rPr>
+      </w:r>
+    </w:p>
+    <w:p>
+      <w:pPr>
+        <w:spacing w:before="0" w:after="80"/>
+        <w:ind w:left="360" w:firstLine="0"/>
+        <w:jc w:val="left"/>
+        <w:shd w:val="clear" w:color="auto" w:fill="EEF0F8"/>
+      </w:pPr>
+      <w:r>
+        <w:rPr>
+          <w:rFonts w:ascii="Garamond" w:hAnsi="Garamond"/>
+          <w:b w:val="0"/>
+          <w:i/>
+          <w:color w:val="2A3055"/>
+          <w:sz w:val="22"/>
+        </w:rPr>
+        <w:t>I'm going to destroy the transmitter. Even if there isn't one. Even if it's them. Even if it's already inside me. I have to try.</w:t>
+      </w:r>
+    </w:p>
+    <w:p>
+      <w:pPr>
+        <w:spacing w:before="80" w:after="80"/>
+        <w:ind w:left="360" w:firstLine="0"/>
+        <w:jc w:val="right"/>
+      </w:pPr>
+      <w:r>
+        <w:rPr>
+          <w:rFonts w:ascii="Garamond" w:hAnsi="Garamond"/>
+          <w:b w:val="0"/>
+          <w:i/>
+          <w:color w:val="2C3E7A"/>
+          <w:sz w:val="20"/>
+        </w:rPr>
+        <w:t>— S. Harris</w:t>
+      </w:r>
+    </w:p>
+    <w:p>
+      <w:pPr>
+        <w:spacing w:before="0" w:after="0" w:lineRule="exact" w:line="80"/>
+      </w:pPr>
+    </w:p>
+    <w:p>
+      <w:pPr>
+        <w:spacing w:before="0" w:after="0" w:lineRule="exact" w:line="80"/>
+      </w:pPr>
+    </w:p>
+    <w:p>
+      <w:pPr>
+        <w:spacing w:before="80" w:after="40"/>
+        <w:ind w:left="360" w:firstLine="0"/>
+      </w:pPr>
+      <w:r>
+        <w:rPr>
+          <w:rFonts w:ascii="Courier New" w:hAnsi="Courier New"/>
+          <w:b/>
+          <w:i w:val="0"/>
+          <w:color w:val="286E28"/>
+          <w:sz w:val="18"/>
+        </w:rPr>
+        <w:t>▶  TAPE CORE-06 — CONTAINMENT CORE</w:t>
+      </w:r>
+    </w:p>
+    <w:p>
+      <w:pPr>
+        <w:spacing w:before="0" w:after="120"/>
+        <w:ind w:left="360" w:firstLine="0"/>
+        <w:jc w:val="left"/>
+        <w:shd w:val="clear" w:color="auto" w:fill="F5EEE4"/>
+      </w:pPr>
+      <w:r>
+        <w:rPr>
+          <w:rFonts w:ascii="Courier New" w:hAnsi="Courier New"/>
+          <w:b w:val="0"/>
+          <w:i/>
+          <w:color w:val="334A22"/>
+          <w:sz w:val="21"/>
+        </w:rPr>
+        <w:t>"If you find this — I made it out. I think. —S.H."</w:t>
+      </w:r>
+    </w:p>
+    <w:p>
+      <w:pPr>
+        <w:spacing w:before="0" w:after="0" w:lineRule="exact" w:line="80"/>
+      </w:pPr>
     </w:p>
     <w:p>
       <w:pPr>
@@ -3361,7 +4721,7 @@
           <w:color w:val="554E3A"/>
           <w:sz w:val="22"/>
         </w:rPr>
-        <w:t>"I pray that is enough."</w:t>
+        <w:t>"The recording does not end with silence."</w:t>
       </w:r>
     </w:p>
     <w:p>
@@ -3379,6 +4739,23 @@
           <w:sz w:val="24"/>
         </w:rPr>
         <w:t>The last known audio recording attributed to Detective S. Harris was recovered from a personal device found inside the Aldric Building — Level 5, Containment Core — on November 9, 1994, by a Department retrieval team. Harris himself was not found.</w:t>
+      </w:r>
+    </w:p>
+    <w:p>
+      <w:pPr>
+        <w:spacing w:before="0" w:after="160"/>
+        <w:ind w:firstLine="432"/>
+        <w:jc w:val="both"/>
+      </w:pPr>
+      <w:r>
+        <w:rPr>
+          <w:rFonts w:ascii="Garamond" w:hAnsi="Garamond"/>
+          <w:b w:val="0"/>
+          <w:i w:val="0"/>
+          <w:color w:val="221C12"/>
+          <w:sz w:val="24"/>
+        </w:rPr>
+        <w:t>The recording runs for forty-one seconds. Department archivists transcribed it. Three separate analysts reviewed the audio. Each filed an independent psychological incident report afterward. Two requested transfer. One resigned.</w:t>
       </w:r>
     </w:p>
     <w:p>
@@ -3403,7 +4780,7 @@
           <w:color w:val="2C3E7A"/>
           <w:sz w:val="18"/>
         </w:rPr>
-        <w:t>HARRIS — AUDIO LOG  |  NOVEMBER 7, 1994  |  FINAL RECORDING</w:t>
+        <w:t>HARRIS — AUDIO LOG  |  NOVEMBER 7, 1994  |  RECORDING 06 — FINAL</w:t>
       </w:r>
     </w:p>
     <w:p>
@@ -3421,7 +4798,7 @@
           <w:color w:val="2A3055"/>
           <w:sz w:val="22"/>
         </w:rPr>
-        <w:t>"The transmitter. I destroyed it. The frequency stopped."</w:t>
+        <w:t>"I destroyed it. The core device. Whatever it was. There was a sound — like a frequency dropping out — and then the building went quiet. Really quiet. The kind of quiet that has a shape to it."</w:t>
       </w:r>
     </w:p>
     <w:p>
@@ -3456,7 +4833,7 @@
           <w:color w:val="2A3055"/>
           <w:sz w:val="22"/>
         </w:rPr>
-        <w:t>"I pray that is enough."</w:t>
+        <w:t>"I think I can make it out. East exit. Stairs. The door was sealed when I came down. I decoded it — I decoded all of them — I just need to—"</w:t>
       </w:r>
     </w:p>
     <w:p>
@@ -3491,7 +4868,147 @@
           <w:color w:val="2A3055"/>
           <w:sz w:val="22"/>
         </w:rPr>
-        <w:t>[Recording ends. Duration: 0:09. No further entries.]</w:t>
+        <w:t>[Footsteps. Fast. Twelve seconds of movement. Then Harris stops.]</w:t>
+      </w:r>
+    </w:p>
+    <w:p>
+      <w:pPr>
+        <w:spacing w:before="0" w:after="80"/>
+        <w:ind w:left="360" w:firstLine="0"/>
+        <w:jc w:val="left"/>
+        <w:shd w:val="clear" w:color="auto" w:fill="EEF0F8"/>
+      </w:pPr>
+      <w:r>
+        <w:rPr>
+          <w:rFonts w:ascii="Garamond" w:hAnsi="Garamond"/>
+          <w:b w:val="0"/>
+          <w:i/>
+          <w:color w:val="2A3055"/>
+          <w:sz w:val="22"/>
+        </w:rPr>
+      </w:r>
+    </w:p>
+    <w:p>
+      <w:pPr>
+        <w:spacing w:before="0" w:after="80"/>
+        <w:ind w:left="360" w:firstLine="0"/>
+        <w:jc w:val="left"/>
+        <w:shd w:val="clear" w:color="auto" w:fill="EEF0F8"/>
+      </w:pPr>
+      <w:r>
+        <w:rPr>
+          <w:rFonts w:ascii="Garamond" w:hAnsi="Garamond"/>
+          <w:b w:val="0"/>
+          <w:i/>
+          <w:color w:val="2A3055"/>
+          <w:sz w:val="22"/>
+        </w:rPr>
+        <w:t>"It's still here."</w:t>
+      </w:r>
+    </w:p>
+    <w:p>
+      <w:pPr>
+        <w:spacing w:before="0" w:after="80"/>
+        <w:ind w:left="360" w:firstLine="0"/>
+        <w:jc w:val="left"/>
+        <w:shd w:val="clear" w:color="auto" w:fill="EEF0F8"/>
+      </w:pPr>
+      <w:r>
+        <w:rPr>
+          <w:rFonts w:ascii="Garamond" w:hAnsi="Garamond"/>
+          <w:b w:val="0"/>
+          <w:i/>
+          <w:color w:val="2A3055"/>
+          <w:sz w:val="22"/>
+        </w:rPr>
+      </w:r>
+    </w:p>
+    <w:p>
+      <w:pPr>
+        <w:spacing w:before="0" w:after="80"/>
+        <w:ind w:left="360" w:firstLine="0"/>
+        <w:jc w:val="left"/>
+        <w:shd w:val="clear" w:color="auto" w:fill="EEF0F8"/>
+      </w:pPr>
+      <w:r>
+        <w:rPr>
+          <w:rFonts w:ascii="Garamond" w:hAnsi="Garamond"/>
+          <w:b w:val="0"/>
+          <w:i/>
+          <w:color w:val="2A3055"/>
+          <w:sz w:val="22"/>
+        </w:rPr>
+        <w:t>[Four seconds of silence.]</w:t>
+      </w:r>
+    </w:p>
+    <w:p>
+      <w:pPr>
+        <w:spacing w:before="0" w:after="80"/>
+        <w:ind w:left="360" w:firstLine="0"/>
+        <w:jc w:val="left"/>
+        <w:shd w:val="clear" w:color="auto" w:fill="EEF0F8"/>
+      </w:pPr>
+      <w:r>
+        <w:rPr>
+          <w:rFonts w:ascii="Garamond" w:hAnsi="Garamond"/>
+          <w:b w:val="0"/>
+          <w:i/>
+          <w:color w:val="2A3055"/>
+          <w:sz w:val="22"/>
+        </w:rPr>
+      </w:r>
+    </w:p>
+    <w:p>
+      <w:pPr>
+        <w:spacing w:before="0" w:after="80"/>
+        <w:ind w:left="360" w:firstLine="0"/>
+        <w:jc w:val="left"/>
+        <w:shd w:val="clear" w:color="auto" w:fill="EEF0F8"/>
+      </w:pPr>
+      <w:r>
+        <w:rPr>
+          <w:rFonts w:ascii="Garamond" w:hAnsi="Garamond"/>
+          <w:b w:val="0"/>
+          <w:i/>
+          <w:color w:val="2A3055"/>
+          <w:sz w:val="22"/>
+        </w:rPr>
+        <w:t>"They're still here. All of them. They didn't — the frequency stopped but they're still — oh god they're—"</w:t>
+      </w:r>
+    </w:p>
+    <w:p>
+      <w:pPr>
+        <w:spacing w:before="0" w:after="80"/>
+        <w:ind w:left="360" w:firstLine="0"/>
+        <w:jc w:val="left"/>
+        <w:shd w:val="clear" w:color="auto" w:fill="EEF0F8"/>
+      </w:pPr>
+      <w:r>
+        <w:rPr>
+          <w:rFonts w:ascii="Garamond" w:hAnsi="Garamond"/>
+          <w:b w:val="0"/>
+          <w:i/>
+          <w:color w:val="2A3055"/>
+          <w:sz w:val="22"/>
+        </w:rPr>
+      </w:r>
+    </w:p>
+    <w:p>
+      <w:pPr>
+        <w:spacing w:before="0" w:after="80"/>
+        <w:ind w:left="360" w:firstLine="0"/>
+        <w:jc w:val="left"/>
+        <w:shd w:val="clear" w:color="auto" w:fill="EEF0F8"/>
+      </w:pPr>
+      <w:r>
+        <w:rPr>
+          <w:rFonts w:ascii="Garamond" w:hAnsi="Garamond"/>
+          <w:b w:val="0"/>
+          <w:i/>
+          <w:color w:val="2A3055"/>
+          <w:sz w:val="22"/>
+        </w:rPr>
+        <w:t>[Indistinct sound. The device microphone distorts. What follows is consistent with a human voice at maximum amplitude. It lasts approximately nine seconds and does not stop cleanly. The recording does not end with silence.]</w:t>
       </w:r>
     </w:p>
     <w:p>
@@ -3508,7 +5025,7 @@
           <w:color w:val="2C3E7A"/>
           <w:sz w:val="20"/>
         </w:rPr>
-        <w:t>— Det. Harris   Nov. 7, 1994</w:t>
+        <w:t>— Det. Harris   Nov. 7, 1994  |  Duration: 0:41</w:t>
       </w:r>
     </w:p>
     <w:p>

</xml_diff>